<commit_message>
performed supply chain analysis, dashboard need little chnages
</commit_message>
<xml_diff>
--- a/learning_material_of supply chain analysis.docx
+++ b/learning_material_of supply chain analysis.docx
@@ -34,65 +34,8 @@
           <w:sz w:val="24"/>
           <w:szCs w:val="24"/>
         </w:rPr>
-        <w:t xml:space="preserve">Company m ek chain ki </w:t>
-      </w:r>
-      <w:proofErr w:type="spellStart"/>
-      <w:r>
-        <w:rPr>
-          <w:sz w:val="24"/>
-          <w:szCs w:val="24"/>
-        </w:rPr>
-        <w:t>trah</w:t>
-      </w:r>
-      <w:proofErr w:type="spellEnd"/>
-      <w:r>
-        <w:rPr>
-          <w:sz w:val="24"/>
-          <w:szCs w:val="24"/>
-        </w:rPr>
-        <w:t xml:space="preserve"> </w:t>
-      </w:r>
-      <w:proofErr w:type="spellStart"/>
-      <w:r>
-        <w:rPr>
-          <w:sz w:val="24"/>
-          <w:szCs w:val="24"/>
-        </w:rPr>
-        <w:t>kaam</w:t>
-      </w:r>
-      <w:proofErr w:type="spellEnd"/>
-      <w:r>
-        <w:rPr>
-          <w:sz w:val="24"/>
-          <w:szCs w:val="24"/>
-        </w:rPr>
-        <w:t xml:space="preserve"> </w:t>
-      </w:r>
-      <w:proofErr w:type="spellStart"/>
-      <w:r>
-        <w:rPr>
-          <w:sz w:val="24"/>
-          <w:szCs w:val="24"/>
-        </w:rPr>
-        <w:t>hota</w:t>
-      </w:r>
-      <w:proofErr w:type="spellEnd"/>
-      <w:r>
-        <w:rPr>
-          <w:sz w:val="24"/>
-          <w:szCs w:val="24"/>
-        </w:rPr>
-        <w:t xml:space="preserve"> h from the production of the product to its </w:t>
-      </w:r>
-      <w:proofErr w:type="spellStart"/>
-      <w:r>
-        <w:rPr>
-          <w:sz w:val="24"/>
-          <w:szCs w:val="24"/>
-        </w:rPr>
-        <w:t>delievery</w:t>
-      </w:r>
-      <w:proofErr w:type="spellEnd"/>
+        <w:t>Company m ek chain ki trah kaam hota h from the production of the product to its delievery</w:t>
+      </w:r>
       <w:r>
         <w:rPr>
           <w:sz w:val="24"/>
@@ -324,23 +267,7 @@
           <w:sz w:val="24"/>
           <w:szCs w:val="24"/>
         </w:rPr>
-        <w:t xml:space="preserve"> We also determine how many products are </w:t>
-      </w:r>
-      <w:proofErr w:type="spellStart"/>
-      <w:r>
-        <w:rPr>
-          <w:sz w:val="24"/>
-          <w:szCs w:val="24"/>
-        </w:rPr>
-        <w:t>entrying</w:t>
-      </w:r>
-      <w:proofErr w:type="spellEnd"/>
-      <w:r>
-        <w:rPr>
-          <w:sz w:val="24"/>
-          <w:szCs w:val="24"/>
-        </w:rPr>
-        <w:t xml:space="preserve"> the inventory and how many going out. </w:t>
+        <w:t xml:space="preserve"> We also determine how many products are entrying the inventory and how many going out. </w:t>
       </w:r>
       <w:r>
         <w:rPr>
@@ -354,167 +281,7 @@
           <w:sz w:val="24"/>
           <w:szCs w:val="24"/>
         </w:rPr>
-        <w:t xml:space="preserve">, </w:t>
-      </w:r>
-      <w:proofErr w:type="spellStart"/>
-      <w:r>
-        <w:rPr>
-          <w:sz w:val="24"/>
-          <w:szCs w:val="24"/>
-        </w:rPr>
-        <w:t>yani</w:t>
-      </w:r>
-      <w:proofErr w:type="spellEnd"/>
-      <w:r>
-        <w:rPr>
-          <w:sz w:val="24"/>
-          <w:szCs w:val="24"/>
-        </w:rPr>
-        <w:t xml:space="preserve"> </w:t>
-      </w:r>
-      <w:proofErr w:type="spellStart"/>
-      <w:r>
-        <w:rPr>
-          <w:sz w:val="24"/>
-          <w:szCs w:val="24"/>
-        </w:rPr>
-        <w:t>mazeed</w:t>
-      </w:r>
-      <w:proofErr w:type="spellEnd"/>
-      <w:r>
-        <w:rPr>
-          <w:sz w:val="24"/>
-          <w:szCs w:val="24"/>
-        </w:rPr>
-        <w:t xml:space="preserve"> y </w:t>
-      </w:r>
-      <w:proofErr w:type="spellStart"/>
-      <w:r>
-        <w:rPr>
-          <w:sz w:val="24"/>
-          <w:szCs w:val="24"/>
-        </w:rPr>
-        <w:t>baat</w:t>
-      </w:r>
-      <w:proofErr w:type="spellEnd"/>
-      <w:r>
-        <w:rPr>
-          <w:sz w:val="24"/>
-          <w:szCs w:val="24"/>
-        </w:rPr>
-        <w:t xml:space="preserve"> </w:t>
-      </w:r>
-      <w:proofErr w:type="spellStart"/>
-      <w:r>
-        <w:rPr>
-          <w:sz w:val="24"/>
-          <w:szCs w:val="24"/>
-        </w:rPr>
-        <w:t>dekhni</w:t>
-      </w:r>
-      <w:proofErr w:type="spellEnd"/>
-      <w:r>
-        <w:rPr>
-          <w:sz w:val="24"/>
-          <w:szCs w:val="24"/>
-        </w:rPr>
-        <w:t xml:space="preserve"> k </w:t>
-      </w:r>
-      <w:proofErr w:type="spellStart"/>
-      <w:r>
-        <w:rPr>
-          <w:sz w:val="24"/>
-          <w:szCs w:val="24"/>
-        </w:rPr>
-        <w:t>mazeed</w:t>
-      </w:r>
-      <w:proofErr w:type="spellEnd"/>
-      <w:r>
-        <w:rPr>
-          <w:sz w:val="24"/>
-          <w:szCs w:val="24"/>
-        </w:rPr>
-        <w:t xml:space="preserve"> </w:t>
-      </w:r>
-      <w:proofErr w:type="spellStart"/>
-      <w:r>
-        <w:rPr>
-          <w:sz w:val="24"/>
-          <w:szCs w:val="24"/>
-        </w:rPr>
-        <w:t>kitni</w:t>
-      </w:r>
-      <w:proofErr w:type="spellEnd"/>
-      <w:r>
-        <w:rPr>
-          <w:sz w:val="24"/>
-          <w:szCs w:val="24"/>
-        </w:rPr>
-        <w:t xml:space="preserve"> products </w:t>
-      </w:r>
-      <w:proofErr w:type="spellStart"/>
-      <w:r>
-        <w:rPr>
-          <w:sz w:val="24"/>
-          <w:szCs w:val="24"/>
-        </w:rPr>
-        <w:t>bnani</w:t>
-      </w:r>
-      <w:proofErr w:type="spellEnd"/>
-      <w:r>
-        <w:rPr>
-          <w:sz w:val="24"/>
-          <w:szCs w:val="24"/>
-        </w:rPr>
-        <w:t xml:space="preserve"> h y logistics k under </w:t>
-      </w:r>
-      <w:proofErr w:type="spellStart"/>
-      <w:r>
-        <w:rPr>
-          <w:sz w:val="24"/>
-          <w:szCs w:val="24"/>
-        </w:rPr>
-        <w:t>nhi</w:t>
-      </w:r>
-      <w:proofErr w:type="spellEnd"/>
-      <w:r>
-        <w:rPr>
-          <w:sz w:val="24"/>
-          <w:szCs w:val="24"/>
-        </w:rPr>
-        <w:t xml:space="preserve"> </w:t>
-      </w:r>
-      <w:proofErr w:type="spellStart"/>
-      <w:r>
-        <w:rPr>
-          <w:sz w:val="24"/>
-          <w:szCs w:val="24"/>
-        </w:rPr>
-        <w:t>ayta</w:t>
-      </w:r>
-      <w:proofErr w:type="spellEnd"/>
-      <w:r>
-        <w:rPr>
-          <w:sz w:val="24"/>
-          <w:szCs w:val="24"/>
-        </w:rPr>
-        <w:t xml:space="preserve">, y supply chain k under </w:t>
-      </w:r>
-      <w:proofErr w:type="spellStart"/>
-      <w:r>
-        <w:rPr>
-          <w:sz w:val="24"/>
-          <w:szCs w:val="24"/>
-        </w:rPr>
-        <w:t>ata</w:t>
-      </w:r>
-      <w:proofErr w:type="spellEnd"/>
-      <w:r>
-        <w:rPr>
-          <w:sz w:val="24"/>
-          <w:szCs w:val="24"/>
-        </w:rPr>
-        <w:t xml:space="preserve"> h</w:t>
+        <w:t>, yani mazeed y baat dekhni k mazeed kitni products bnani h y logistics k under nhi ayta, y supply chain k under ata h</w:t>
       </w:r>
     </w:p>
     <w:p>
@@ -556,23 +323,7 @@
           <w:sz w:val="24"/>
           <w:szCs w:val="24"/>
         </w:rPr>
-        <w:t xml:space="preserve">When we load our data to </w:t>
-      </w:r>
-      <w:proofErr w:type="spellStart"/>
-      <w:r>
-        <w:rPr>
-          <w:sz w:val="24"/>
-          <w:szCs w:val="24"/>
-        </w:rPr>
-        <w:t>PowerQE</w:t>
-      </w:r>
-      <w:proofErr w:type="spellEnd"/>
-      <w:r>
-        <w:rPr>
-          <w:sz w:val="24"/>
-          <w:szCs w:val="24"/>
-        </w:rPr>
-        <w:t xml:space="preserve"> editor, all the files are present in a specific file location. For example, each file in the dataset has a specific location. When we transfer or when we send this project to someone else, the files' location</w:t>
+        <w:t>When we load our data to PowerQE editor, all the files are present in a specific file location. For example, each file in the dataset has a specific location. When we transfer or when we send this project to someone else, the files' location</w:t>
       </w:r>
       <w:r>
         <w:rPr>
@@ -614,39 +365,7 @@
           <w:sz w:val="24"/>
           <w:szCs w:val="24"/>
         </w:rPr>
-        <w:t xml:space="preserve"> from the dataset </w:t>
-      </w:r>
-      <w:proofErr w:type="gramStart"/>
-      <w:r>
-        <w:rPr>
-          <w:sz w:val="24"/>
-          <w:szCs w:val="24"/>
-        </w:rPr>
-        <w:t>files</w:t>
-      </w:r>
-      <w:proofErr w:type="gramEnd"/>
-      <w:r>
-        <w:rPr>
-          <w:sz w:val="24"/>
-          <w:szCs w:val="24"/>
-        </w:rPr>
-        <w:t xml:space="preserve"> location that is present in their computer. As a result, he cannot use the project; it will generate an error because </w:t>
-      </w:r>
-      <w:proofErr w:type="spellStart"/>
-      <w:r>
-        <w:rPr>
-          <w:sz w:val="24"/>
-          <w:szCs w:val="24"/>
-        </w:rPr>
-        <w:t>PowerQE</w:t>
-      </w:r>
-      <w:proofErr w:type="spellEnd"/>
-      <w:r>
-        <w:rPr>
-          <w:sz w:val="24"/>
-          <w:szCs w:val="24"/>
-        </w:rPr>
-        <w:t xml:space="preserve"> editor is trying to look at the location that is present in the project</w:t>
+        <w:t xml:space="preserve"> from the dataset files location that is present in their computer. As a result, he cannot use the project; it will generate an error because PowerQE editor is trying to look at the location that is present in the project</w:t>
       </w:r>
       <w:r>
         <w:rPr>
@@ -709,237 +428,29 @@
           <w:sz w:val="24"/>
           <w:szCs w:val="24"/>
         </w:rPr>
-        <w:t xml:space="preserve">, if we don’t use this feature, then receiver ko </w:t>
-      </w:r>
-      <w:proofErr w:type="spellStart"/>
-      <w:r>
-        <w:rPr>
-          <w:sz w:val="24"/>
-          <w:szCs w:val="24"/>
-        </w:rPr>
-        <w:t>hr</w:t>
-      </w:r>
-      <w:proofErr w:type="spellEnd"/>
-      <w:r>
-        <w:rPr>
-          <w:sz w:val="24"/>
-          <w:szCs w:val="24"/>
-        </w:rPr>
-        <w:t xml:space="preserve"> </w:t>
-      </w:r>
-      <w:proofErr w:type="spellStart"/>
-      <w:r>
-        <w:rPr>
-          <w:sz w:val="24"/>
-          <w:szCs w:val="24"/>
-        </w:rPr>
-        <w:t>hr</w:t>
-      </w:r>
-      <w:proofErr w:type="spellEnd"/>
-      <w:r>
-        <w:rPr>
-          <w:sz w:val="24"/>
-          <w:szCs w:val="24"/>
-        </w:rPr>
-        <w:t xml:space="preserve"> data file k </w:t>
-      </w:r>
-      <w:proofErr w:type="spellStart"/>
-      <w:r>
-        <w:rPr>
-          <w:sz w:val="24"/>
-          <w:szCs w:val="24"/>
-        </w:rPr>
-        <w:t>liye</w:t>
-      </w:r>
-      <w:proofErr w:type="spellEnd"/>
-      <w:r>
-        <w:rPr>
-          <w:sz w:val="24"/>
-          <w:szCs w:val="24"/>
-        </w:rPr>
-        <w:t xml:space="preserve"> source m ja </w:t>
-      </w:r>
-      <w:proofErr w:type="spellStart"/>
-      <w:r>
-        <w:rPr>
-          <w:sz w:val="24"/>
-          <w:szCs w:val="24"/>
-        </w:rPr>
-        <w:t>kr</w:t>
-      </w:r>
-      <w:proofErr w:type="spellEnd"/>
-      <w:r>
-        <w:rPr>
-          <w:sz w:val="24"/>
-          <w:szCs w:val="24"/>
-        </w:rPr>
-        <w:t xml:space="preserve"> </w:t>
-      </w:r>
-      <w:r>
-        <w:rPr>
-          <w:sz w:val="24"/>
-          <w:szCs w:val="24"/>
-        </w:rPr>
-        <w:t xml:space="preserve">file ka new path </w:t>
-      </w:r>
-      <w:proofErr w:type="spellStart"/>
-      <w:r>
-        <w:rPr>
-          <w:sz w:val="24"/>
-          <w:szCs w:val="24"/>
-        </w:rPr>
-        <w:t>dena</w:t>
-      </w:r>
-      <w:proofErr w:type="spellEnd"/>
-      <w:r>
-        <w:rPr>
-          <w:sz w:val="24"/>
-          <w:szCs w:val="24"/>
-        </w:rPr>
-        <w:t xml:space="preserve"> pry ga, </w:t>
-      </w:r>
-      <w:proofErr w:type="spellStart"/>
-      <w:r>
-        <w:rPr>
-          <w:sz w:val="24"/>
-          <w:szCs w:val="24"/>
-        </w:rPr>
-        <w:t>agr</w:t>
-      </w:r>
-      <w:proofErr w:type="spellEnd"/>
-      <w:r>
-        <w:rPr>
-          <w:sz w:val="24"/>
-          <w:szCs w:val="24"/>
-        </w:rPr>
-        <w:t xml:space="preserve"> hm y feature use </w:t>
-      </w:r>
-      <w:proofErr w:type="spellStart"/>
-      <w:r>
-        <w:rPr>
-          <w:sz w:val="24"/>
-          <w:szCs w:val="24"/>
-        </w:rPr>
-        <w:t>kr</w:t>
-      </w:r>
-      <w:proofErr w:type="spellEnd"/>
-      <w:r>
-        <w:rPr>
-          <w:sz w:val="24"/>
-          <w:szCs w:val="24"/>
-        </w:rPr>
-        <w:t xml:space="preserve"> </w:t>
-      </w:r>
-      <w:proofErr w:type="spellStart"/>
-      <w:r>
-        <w:rPr>
-          <w:sz w:val="24"/>
-          <w:szCs w:val="24"/>
-        </w:rPr>
-        <w:t>lety</w:t>
-      </w:r>
-      <w:proofErr w:type="spellEnd"/>
-      <w:r>
-        <w:rPr>
-          <w:sz w:val="24"/>
-          <w:szCs w:val="24"/>
-        </w:rPr>
-        <w:t xml:space="preserve"> </w:t>
-      </w:r>
-      <w:proofErr w:type="spellStart"/>
-      <w:r>
-        <w:rPr>
-          <w:sz w:val="24"/>
-          <w:szCs w:val="24"/>
-        </w:rPr>
-        <w:t>hn</w:t>
-      </w:r>
-      <w:proofErr w:type="spellEnd"/>
-      <w:r>
-        <w:rPr>
-          <w:sz w:val="24"/>
-          <w:szCs w:val="24"/>
-        </w:rPr>
-        <w:t xml:space="preserve"> to </w:t>
-      </w:r>
-      <w:proofErr w:type="spellStart"/>
-      <w:r>
-        <w:rPr>
-          <w:sz w:val="24"/>
-          <w:szCs w:val="24"/>
-        </w:rPr>
-        <w:t>usy</w:t>
-      </w:r>
-      <w:proofErr w:type="spellEnd"/>
-      <w:r>
-        <w:rPr>
-          <w:sz w:val="24"/>
-          <w:szCs w:val="24"/>
-        </w:rPr>
-        <w:t xml:space="preserve"> just ek hi </w:t>
-      </w:r>
-      <w:proofErr w:type="spellStart"/>
-      <w:r>
-        <w:rPr>
-          <w:sz w:val="24"/>
-          <w:szCs w:val="24"/>
-        </w:rPr>
-        <w:t>jga</w:t>
-      </w:r>
-      <w:proofErr w:type="spellEnd"/>
-      <w:r>
-        <w:rPr>
-          <w:sz w:val="24"/>
-          <w:szCs w:val="24"/>
-        </w:rPr>
-        <w:t xml:space="preserve"> </w:t>
-      </w:r>
-      <w:proofErr w:type="spellStart"/>
-      <w:r>
-        <w:rPr>
-          <w:sz w:val="24"/>
-          <w:szCs w:val="24"/>
-        </w:rPr>
-        <w:t>dena</w:t>
-      </w:r>
-      <w:proofErr w:type="spellEnd"/>
-      <w:r>
-        <w:rPr>
-          <w:sz w:val="24"/>
-          <w:szCs w:val="24"/>
-        </w:rPr>
-        <w:t xml:space="preserve"> pry ga new file location ko</w:t>
-      </w:r>
-    </w:p>
-    <w:p>
-      <w:pPr>
-        <w:rPr>
-          <w:sz w:val="24"/>
-          <w:szCs w:val="24"/>
-        </w:rPr>
-      </w:pPr>
-      <w:r>
-        <w:rPr>
-          <w:sz w:val="24"/>
-          <w:szCs w:val="24"/>
-        </w:rPr>
-        <w:t xml:space="preserve">For this reason, we will go to the Home tab of Power Query Editor, click Manage parameters, and then we will click on </w:t>
-      </w:r>
-      <w:proofErr w:type="gramStart"/>
-      <w:r>
-        <w:rPr>
-          <w:sz w:val="24"/>
-          <w:szCs w:val="24"/>
-        </w:rPr>
-        <w:t>New</w:t>
-      </w:r>
-      <w:proofErr w:type="gramEnd"/>
-      <w:r>
-        <w:rPr>
-          <w:sz w:val="24"/>
-          <w:szCs w:val="24"/>
-        </w:rPr>
-        <w:t xml:space="preserve"> parameters under Manage parameters drop-down. </w:t>
+        <w:t xml:space="preserve">, if we don’t use this feature, then receiver ko hr hr data file k liye source m ja kr </w:t>
+      </w:r>
+      <w:r>
+        <w:rPr>
+          <w:sz w:val="24"/>
+          <w:szCs w:val="24"/>
+        </w:rPr>
+        <w:t>file ka new path dena pry ga, agr hm y feature use kr lety hn to usy just ek hi jga dena pry ga new file location ko</w:t>
+      </w:r>
+    </w:p>
+    <w:p>
+      <w:pPr>
+        <w:rPr>
+          <w:sz w:val="24"/>
+          <w:szCs w:val="24"/>
+        </w:rPr>
+      </w:pPr>
+      <w:r>
+        <w:rPr>
+          <w:sz w:val="24"/>
+          <w:szCs w:val="24"/>
+        </w:rPr>
+        <w:t xml:space="preserve">For this reason, we will go to the Home tab of Power Query Editor, click Manage parameters, and then we will click on New parameters under Manage parameters drop-down. </w:t>
       </w:r>
       <w:r>
         <w:rPr>
@@ -989,32 +500,15 @@
           <w:sz w:val="24"/>
           <w:szCs w:val="24"/>
         </w:rPr>
-        <w:t xml:space="preserve"> In this </w:t>
-      </w:r>
-      <w:proofErr w:type="gramStart"/>
-      <w:r>
-        <w:rPr>
-          <w:sz w:val="24"/>
-          <w:szCs w:val="24"/>
-        </w:rPr>
-        <w:t xml:space="preserve">case </w:t>
-      </w:r>
-      <w:r>
-        <w:rPr>
-          <w:sz w:val="24"/>
-          <w:szCs w:val="24"/>
-        </w:rPr>
-        <w:t xml:space="preserve"> We</w:t>
-      </w:r>
-      <w:proofErr w:type="gramEnd"/>
-      <w:r>
-        <w:rPr>
-          <w:sz w:val="24"/>
-          <w:szCs w:val="24"/>
-        </w:rPr>
-        <w:t xml:space="preserve"> write </w:t>
-      </w:r>
-      <w:proofErr w:type="gramStart"/>
+        <w:t xml:space="preserve"> In this case </w:t>
+      </w:r>
+      <w:r>
+        <w:rPr>
+          <w:sz w:val="24"/>
+          <w:szCs w:val="24"/>
+        </w:rPr>
+        <w:t xml:space="preserve"> We write </w:t>
+      </w:r>
       <w:r>
         <w:rPr>
           <w:sz w:val="24"/>
@@ -1036,7 +530,6 @@
         </w:rPr>
         <w:t>“</w:t>
       </w:r>
-      <w:proofErr w:type="gramEnd"/>
       <w:r>
         <w:rPr>
           <w:sz w:val="24"/>
@@ -1092,46 +585,14 @@
           <w:sz w:val="24"/>
           <w:szCs w:val="24"/>
         </w:rPr>
-        <w:t xml:space="preserve">In the left side of </w:t>
-      </w:r>
-      <w:proofErr w:type="spellStart"/>
-      <w:r>
-        <w:rPr>
-          <w:sz w:val="24"/>
-          <w:szCs w:val="24"/>
-        </w:rPr>
-        <w:t>PowerQri</w:t>
-      </w:r>
-      <w:proofErr w:type="spellEnd"/>
-      <w:r>
-        <w:rPr>
-          <w:sz w:val="24"/>
-          <w:szCs w:val="24"/>
-        </w:rPr>
-        <w:t xml:space="preserve"> editor where the names of all dataset files are shown, there is another folder, or, as it is shown as file names, a file named 'folder path' will be shown. Now, in the dataset where all files' names are present, </w:t>
-      </w:r>
-      <w:r>
-        <w:rPr>
-          <w:sz w:val="24"/>
-          <w:szCs w:val="24"/>
-        </w:rPr>
-        <w:t xml:space="preserve">jo k sab s upper show </w:t>
-      </w:r>
-      <w:proofErr w:type="spellStart"/>
-      <w:r>
-        <w:rPr>
-          <w:sz w:val="24"/>
-          <w:szCs w:val="24"/>
-        </w:rPr>
-        <w:t>hoti</w:t>
-      </w:r>
-      <w:proofErr w:type="spellEnd"/>
-      <w:r>
-        <w:rPr>
-          <w:sz w:val="24"/>
-          <w:szCs w:val="24"/>
-        </w:rPr>
-        <w:t xml:space="preserve"> h</w:t>
+        <w:t xml:space="preserve">In the left side of PowerQri editor where the names of all dataset files are shown, there is another folder, or, as it is shown as file names, a file named 'folder path' will be shown. Now, in the dataset where all files' names are present, </w:t>
+      </w:r>
+      <w:r>
+        <w:rPr>
+          <w:sz w:val="24"/>
+          <w:szCs w:val="24"/>
+        </w:rPr>
+        <w:t>jo k sab s upper show hoti h</w:t>
       </w:r>
       <w:r>
         <w:rPr>
@@ -1224,346 +685,34 @@
           <w:sz w:val="24"/>
           <w:szCs w:val="24"/>
         </w:rPr>
-        <w:t xml:space="preserve">Now we will go to each file </w:t>
-      </w:r>
-      <w:proofErr w:type="spellStart"/>
-      <w:r>
-        <w:rPr>
-          <w:sz w:val="24"/>
-          <w:szCs w:val="24"/>
-        </w:rPr>
-        <w:t>dim_customer</w:t>
-      </w:r>
-      <w:proofErr w:type="spellEnd"/>
-      <w:r>
-        <w:rPr>
-          <w:sz w:val="24"/>
-          <w:szCs w:val="24"/>
-        </w:rPr>
-        <w:t xml:space="preserve">, </w:t>
-      </w:r>
-      <w:proofErr w:type="spellStart"/>
-      <w:r>
-        <w:rPr>
-          <w:sz w:val="24"/>
-          <w:szCs w:val="24"/>
-        </w:rPr>
-        <w:t>dim_date</w:t>
-      </w:r>
-      <w:proofErr w:type="spellEnd"/>
-      <w:r>
-        <w:rPr>
-          <w:sz w:val="24"/>
-          <w:szCs w:val="24"/>
-        </w:rPr>
-        <w:t xml:space="preserve"> </w:t>
-      </w:r>
-      <w:proofErr w:type="spellStart"/>
-      <w:r>
-        <w:rPr>
-          <w:sz w:val="24"/>
-          <w:szCs w:val="24"/>
-        </w:rPr>
-        <w:t>etc</w:t>
-      </w:r>
-      <w:proofErr w:type="spellEnd"/>
-      <w:r>
-        <w:rPr>
-          <w:sz w:val="24"/>
-          <w:szCs w:val="24"/>
-        </w:rPr>
-        <w:t xml:space="preserve"> </w:t>
-      </w:r>
-      <w:proofErr w:type="spellStart"/>
-      <w:r>
-        <w:rPr>
-          <w:sz w:val="24"/>
-          <w:szCs w:val="24"/>
-        </w:rPr>
-        <w:t>etc</w:t>
-      </w:r>
-      <w:proofErr w:type="spellEnd"/>
-      <w:r>
-        <w:rPr>
-          <w:sz w:val="24"/>
-          <w:szCs w:val="24"/>
-        </w:rPr>
-        <w:t xml:space="preserve"> and applied steps m navigation m ja </w:t>
-      </w:r>
-      <w:proofErr w:type="spellStart"/>
-      <w:r>
-        <w:rPr>
-          <w:sz w:val="24"/>
-          <w:szCs w:val="24"/>
-        </w:rPr>
-        <w:t>kr</w:t>
-      </w:r>
-      <w:proofErr w:type="spellEnd"/>
-      <w:r>
-        <w:rPr>
-          <w:sz w:val="24"/>
-          <w:szCs w:val="24"/>
-        </w:rPr>
-        <w:t xml:space="preserve"> upper </w:t>
-      </w:r>
-      <w:proofErr w:type="spellStart"/>
-      <w:r>
-        <w:rPr>
-          <w:sz w:val="24"/>
-          <w:szCs w:val="24"/>
-        </w:rPr>
-        <w:t>jahn</w:t>
-      </w:r>
-      <w:proofErr w:type="spellEnd"/>
-      <w:r>
-        <w:rPr>
-          <w:sz w:val="24"/>
-          <w:szCs w:val="24"/>
-        </w:rPr>
-        <w:t xml:space="preserve"> folder path </w:t>
-      </w:r>
-      <w:proofErr w:type="gramStart"/>
-      <w:r>
-        <w:rPr>
-          <w:sz w:val="24"/>
-          <w:szCs w:val="24"/>
-        </w:rPr>
-        <w:t>p[</w:t>
-      </w:r>
-      <w:proofErr w:type="spellStart"/>
-      <w:proofErr w:type="gramEnd"/>
-      <w:r>
-        <w:rPr>
-          <w:sz w:val="24"/>
-          <w:szCs w:val="24"/>
-        </w:rPr>
-        <w:t>ura</w:t>
-      </w:r>
-      <w:proofErr w:type="spellEnd"/>
-      <w:r>
-        <w:rPr>
-          <w:sz w:val="24"/>
-          <w:szCs w:val="24"/>
-        </w:rPr>
-        <w:t xml:space="preserve"> mention h commas k </w:t>
-      </w:r>
-      <w:proofErr w:type="spellStart"/>
-      <w:r>
-        <w:rPr>
-          <w:sz w:val="24"/>
-          <w:szCs w:val="24"/>
-        </w:rPr>
-        <w:t>andr</w:t>
-      </w:r>
-      <w:proofErr w:type="spellEnd"/>
-      <w:r>
-        <w:rPr>
-          <w:sz w:val="24"/>
-          <w:szCs w:val="24"/>
-        </w:rPr>
-        <w:t xml:space="preserve">, us ko </w:t>
-      </w:r>
-      <w:proofErr w:type="spellStart"/>
-      <w:r>
-        <w:rPr>
-          <w:sz w:val="24"/>
-          <w:szCs w:val="24"/>
-        </w:rPr>
-        <w:t>hta</w:t>
-      </w:r>
-      <w:proofErr w:type="spellEnd"/>
-      <w:r>
-        <w:rPr>
-          <w:sz w:val="24"/>
-          <w:szCs w:val="24"/>
-        </w:rPr>
-        <w:t xml:space="preserve"> </w:t>
-      </w:r>
-      <w:proofErr w:type="spellStart"/>
-      <w:r>
-        <w:rPr>
-          <w:sz w:val="24"/>
-          <w:szCs w:val="24"/>
-        </w:rPr>
-        <w:t>kr</w:t>
-      </w:r>
-      <w:proofErr w:type="spellEnd"/>
-      <w:r>
-        <w:rPr>
-          <w:sz w:val="24"/>
-          <w:szCs w:val="24"/>
-        </w:rPr>
-        <w:t xml:space="preserve"> just folder path </w:t>
-      </w:r>
-      <w:proofErr w:type="spellStart"/>
-      <w:r>
-        <w:rPr>
-          <w:sz w:val="24"/>
-          <w:szCs w:val="24"/>
-        </w:rPr>
-        <w:t>likh</w:t>
-      </w:r>
-      <w:proofErr w:type="spellEnd"/>
-      <w:r>
-        <w:rPr>
-          <w:sz w:val="24"/>
-          <w:szCs w:val="24"/>
-        </w:rPr>
-        <w:t xml:space="preserve"> den </w:t>
-      </w:r>
-      <w:proofErr w:type="spellStart"/>
-      <w:r>
-        <w:rPr>
-          <w:sz w:val="24"/>
-          <w:szCs w:val="24"/>
-        </w:rPr>
-        <w:t>gy</w:t>
-      </w:r>
-      <w:proofErr w:type="spellEnd"/>
-      <w:r>
-        <w:rPr>
-          <w:sz w:val="24"/>
-          <w:szCs w:val="24"/>
-        </w:rPr>
-        <w:t xml:space="preserve">, or </w:t>
-      </w:r>
-      <w:proofErr w:type="spellStart"/>
-      <w:r>
-        <w:rPr>
-          <w:sz w:val="24"/>
-          <w:szCs w:val="24"/>
-        </w:rPr>
-        <w:t>esa</w:t>
-      </w:r>
-      <w:proofErr w:type="spellEnd"/>
-      <w:r>
-        <w:rPr>
-          <w:sz w:val="24"/>
-          <w:szCs w:val="24"/>
-        </w:rPr>
-        <w:t xml:space="preserve"> hm </w:t>
-      </w:r>
-      <w:proofErr w:type="spellStart"/>
-      <w:r>
-        <w:rPr>
-          <w:sz w:val="24"/>
-          <w:szCs w:val="24"/>
-        </w:rPr>
-        <w:t>hr</w:t>
-      </w:r>
-      <w:proofErr w:type="spellEnd"/>
-      <w:r>
-        <w:rPr>
-          <w:sz w:val="24"/>
-          <w:szCs w:val="24"/>
-        </w:rPr>
-        <w:t xml:space="preserve"> </w:t>
-      </w:r>
-      <w:proofErr w:type="spellStart"/>
-      <w:r>
-        <w:rPr>
-          <w:sz w:val="24"/>
-          <w:szCs w:val="24"/>
-        </w:rPr>
-        <w:t>hr</w:t>
-      </w:r>
-      <w:proofErr w:type="spellEnd"/>
-      <w:r>
-        <w:rPr>
-          <w:sz w:val="24"/>
-          <w:szCs w:val="24"/>
-        </w:rPr>
-        <w:t xml:space="preserve"> data file k </w:t>
-      </w:r>
-      <w:proofErr w:type="spellStart"/>
-      <w:r>
-        <w:rPr>
-          <w:sz w:val="24"/>
-          <w:szCs w:val="24"/>
-        </w:rPr>
-        <w:t>saath</w:t>
-      </w:r>
-      <w:proofErr w:type="spellEnd"/>
-      <w:r>
-        <w:rPr>
-          <w:sz w:val="24"/>
-          <w:szCs w:val="24"/>
-        </w:rPr>
-        <w:t xml:space="preserve"> </w:t>
-      </w:r>
-      <w:proofErr w:type="spellStart"/>
-      <w:r>
-        <w:rPr>
-          <w:sz w:val="24"/>
-          <w:szCs w:val="24"/>
-        </w:rPr>
-        <w:t>kryn</w:t>
-      </w:r>
-      <w:proofErr w:type="spellEnd"/>
-      <w:r>
-        <w:rPr>
-          <w:sz w:val="24"/>
-          <w:szCs w:val="24"/>
-        </w:rPr>
-        <w:t xml:space="preserve"> </w:t>
-      </w:r>
-      <w:proofErr w:type="spellStart"/>
-      <w:r>
-        <w:rPr>
-          <w:sz w:val="24"/>
-          <w:szCs w:val="24"/>
-        </w:rPr>
-        <w:t>gy</w:t>
-      </w:r>
-      <w:proofErr w:type="spellEnd"/>
-      <w:r>
-        <w:rPr>
-          <w:sz w:val="24"/>
-          <w:szCs w:val="24"/>
-        </w:rPr>
-        <w:t xml:space="preserve">, </w:t>
-      </w:r>
-    </w:p>
-    <w:p>
-      <w:pPr>
-        <w:rPr>
-          <w:sz w:val="24"/>
-          <w:szCs w:val="24"/>
-        </w:rPr>
-      </w:pPr>
-      <w:r>
-        <w:rPr>
-          <w:sz w:val="24"/>
-          <w:szCs w:val="24"/>
-        </w:rPr>
-        <w:t xml:space="preserve">Now if we change the </w:t>
-      </w:r>
-      <w:proofErr w:type="spellStart"/>
-      <w:r>
-        <w:rPr>
-          <w:sz w:val="24"/>
-          <w:szCs w:val="24"/>
-        </w:rPr>
-        <w:t>locationof</w:t>
-      </w:r>
-      <w:proofErr w:type="spellEnd"/>
-      <w:r>
-        <w:rPr>
-          <w:sz w:val="24"/>
-          <w:szCs w:val="24"/>
-        </w:rPr>
-        <w:t xml:space="preserve"> dataset in our computer and refresh the power query editor, we will get error like that: </w:t>
-      </w:r>
-    </w:p>
-    <w:p>
-      <w:pPr>
-        <w:rPr>
-          <w:sz w:val="24"/>
-          <w:szCs w:val="24"/>
-        </w:rPr>
-      </w:pPr>
-      <w:r>
-        <w:rPr>
+        <w:t xml:space="preserve">Now we will go to each file dim_customer, dim_date etc etc and applied steps m navigation m ja kr upper jahn folder path p[ura mention h commas k andr, us ko hta kr just folder path likh den gy, or esa hm hr hr data file k saath kryn gy, </w:t>
+      </w:r>
+    </w:p>
+    <w:p>
+      <w:pPr>
+        <w:rPr>
+          <w:sz w:val="24"/>
+          <w:szCs w:val="24"/>
+        </w:rPr>
+      </w:pPr>
+      <w:r>
+        <w:rPr>
+          <w:sz w:val="24"/>
+          <w:szCs w:val="24"/>
+        </w:rPr>
+        <w:t xml:space="preserve">Now if we change the locationof dataset in our computer and refresh the power query editor, we will get error like that: </w:t>
+      </w:r>
+    </w:p>
+    <w:p>
+      <w:pPr>
+        <w:rPr>
+          <w:sz w:val="24"/>
+          <w:szCs w:val="24"/>
+        </w:rPr>
+      </w:pPr>
+      <w:r>
+        <w:rPr>
+          <w:noProof/>
           <w:sz w:val="24"/>
           <w:szCs w:val="24"/>
         </w:rPr>
@@ -1619,199 +768,7 @@
           <w:sz w:val="24"/>
           <w:szCs w:val="24"/>
         </w:rPr>
-        <w:t xml:space="preserve">Because file location is changed , </w:t>
-      </w:r>
-      <w:proofErr w:type="spellStart"/>
-      <w:r>
-        <w:rPr>
-          <w:sz w:val="24"/>
-          <w:szCs w:val="24"/>
-        </w:rPr>
-        <w:t>esa</w:t>
-      </w:r>
-      <w:proofErr w:type="spellEnd"/>
-      <w:r>
-        <w:rPr>
-          <w:sz w:val="24"/>
-          <w:szCs w:val="24"/>
-        </w:rPr>
-        <w:t xml:space="preserve"> error hi receiver/client ko </w:t>
-      </w:r>
-      <w:proofErr w:type="spellStart"/>
-      <w:r>
-        <w:rPr>
-          <w:sz w:val="24"/>
-          <w:szCs w:val="24"/>
-        </w:rPr>
-        <w:t>bhi</w:t>
-      </w:r>
-      <w:proofErr w:type="spellEnd"/>
-      <w:r>
-        <w:rPr>
-          <w:sz w:val="24"/>
-          <w:szCs w:val="24"/>
-        </w:rPr>
-        <w:t xml:space="preserve"> ay ga, is </w:t>
-      </w:r>
-      <w:proofErr w:type="spellStart"/>
-      <w:r>
-        <w:rPr>
-          <w:sz w:val="24"/>
-          <w:szCs w:val="24"/>
-        </w:rPr>
-        <w:t>liye</w:t>
-      </w:r>
-      <w:proofErr w:type="spellEnd"/>
-      <w:r>
-        <w:rPr>
-          <w:sz w:val="24"/>
-          <w:szCs w:val="24"/>
-        </w:rPr>
-        <w:t xml:space="preserve"> hm just changed location ka path folder path m (jo k last m mention h jo hm new parameter k </w:t>
-      </w:r>
-      <w:proofErr w:type="spellStart"/>
-      <w:r>
-        <w:rPr>
-          <w:sz w:val="24"/>
-          <w:szCs w:val="24"/>
-        </w:rPr>
-        <w:t>zrye</w:t>
-      </w:r>
-      <w:proofErr w:type="spellEnd"/>
-      <w:r>
-        <w:rPr>
-          <w:sz w:val="24"/>
-          <w:szCs w:val="24"/>
-        </w:rPr>
-        <w:t xml:space="preserve"> </w:t>
-      </w:r>
-      <w:proofErr w:type="spellStart"/>
-      <w:r>
-        <w:rPr>
-          <w:sz w:val="24"/>
-          <w:szCs w:val="24"/>
-        </w:rPr>
-        <w:t>bnai</w:t>
-      </w:r>
-      <w:proofErr w:type="spellEnd"/>
-      <w:r>
-        <w:rPr>
-          <w:sz w:val="24"/>
-          <w:szCs w:val="24"/>
-        </w:rPr>
-        <w:t xml:space="preserve"> </w:t>
-      </w:r>
-      <w:proofErr w:type="spellStart"/>
-      <w:r>
-        <w:rPr>
-          <w:sz w:val="24"/>
-          <w:szCs w:val="24"/>
-        </w:rPr>
-        <w:t>thi</w:t>
-      </w:r>
-      <w:proofErr w:type="spellEnd"/>
-      <w:r>
-        <w:rPr>
-          <w:sz w:val="24"/>
-          <w:szCs w:val="24"/>
-        </w:rPr>
-        <w:t xml:space="preserve">) den </w:t>
-      </w:r>
-      <w:proofErr w:type="spellStart"/>
-      <w:r>
-        <w:rPr>
-          <w:sz w:val="24"/>
-          <w:szCs w:val="24"/>
-        </w:rPr>
-        <w:t>gy</w:t>
-      </w:r>
-      <w:proofErr w:type="spellEnd"/>
-      <w:r>
-        <w:rPr>
-          <w:sz w:val="24"/>
-          <w:szCs w:val="24"/>
-        </w:rPr>
-        <w:t xml:space="preserve"> and refresh </w:t>
-      </w:r>
-      <w:proofErr w:type="spellStart"/>
-      <w:r>
-        <w:rPr>
-          <w:sz w:val="24"/>
-          <w:szCs w:val="24"/>
-        </w:rPr>
-        <w:t>krny</w:t>
-      </w:r>
-      <w:proofErr w:type="spellEnd"/>
-      <w:r>
-        <w:rPr>
-          <w:sz w:val="24"/>
-          <w:szCs w:val="24"/>
-        </w:rPr>
-        <w:t xml:space="preserve"> s </w:t>
-      </w:r>
-      <w:proofErr w:type="spellStart"/>
-      <w:r>
-        <w:rPr>
-          <w:sz w:val="24"/>
-          <w:szCs w:val="24"/>
-        </w:rPr>
-        <w:t>saary</w:t>
-      </w:r>
-      <w:proofErr w:type="spellEnd"/>
-      <w:r>
-        <w:rPr>
-          <w:sz w:val="24"/>
-          <w:szCs w:val="24"/>
-        </w:rPr>
-        <w:t xml:space="preserve"> ki </w:t>
-      </w:r>
-      <w:proofErr w:type="spellStart"/>
-      <w:r>
-        <w:rPr>
-          <w:sz w:val="24"/>
-          <w:szCs w:val="24"/>
-        </w:rPr>
-        <w:t>saary</w:t>
-      </w:r>
-      <w:proofErr w:type="spellEnd"/>
-      <w:r>
-        <w:rPr>
-          <w:sz w:val="24"/>
-          <w:szCs w:val="24"/>
-        </w:rPr>
-        <w:t xml:space="preserve"> errors khatam ho </w:t>
-      </w:r>
-      <w:proofErr w:type="spellStart"/>
-      <w:r>
-        <w:rPr>
-          <w:sz w:val="24"/>
-          <w:szCs w:val="24"/>
-        </w:rPr>
-        <w:t>jayn</w:t>
-      </w:r>
-      <w:proofErr w:type="spellEnd"/>
-      <w:r>
-        <w:rPr>
-          <w:sz w:val="24"/>
-          <w:szCs w:val="24"/>
-        </w:rPr>
-        <w:t xml:space="preserve"> </w:t>
-      </w:r>
-      <w:proofErr w:type="spellStart"/>
-      <w:r>
-        <w:rPr>
-          <w:sz w:val="24"/>
-          <w:szCs w:val="24"/>
-        </w:rPr>
-        <w:t>gy</w:t>
-      </w:r>
-      <w:proofErr w:type="spellEnd"/>
-      <w:r>
-        <w:rPr>
-          <w:sz w:val="24"/>
-          <w:szCs w:val="24"/>
-        </w:rPr>
-        <w:t xml:space="preserve">,,, if we have not used new parameter function, we have to change the </w:t>
+        <w:t xml:space="preserve">Because file location is changed , esa error hi receiver/client ko bhi ay ga, is liye hm just changed location ka path folder path m (jo k last m mention h jo hm new parameter k zrye bnai thi) den gy and refresh krny s saary ki saary errors khatam ho jayn gy,,, if we have not used new parameter function, we have to change the </w:t>
       </w:r>
       <w:r>
         <w:rPr>
@@ -1846,6 +803,9 @@
     </w:p>
     <w:p>
       <w:pPr>
+        <w:pBdr>
+          <w:bottom w:val="single" w:sz="6" w:space="1" w:color="auto"/>
+        </w:pBdr>
         <w:rPr>
           <w:sz w:val="24"/>
           <w:szCs w:val="24"/>
@@ -1857,11 +817,101 @@
           <w:szCs w:val="24"/>
         </w:rPr>
         <w:lastRenderedPageBreak/>
+        <w:t xml:space="preserve">The total cost in the procurement table is slightly different from the total cost in the total sales table. The procurement table is showing us the total cost for purchasing that product, and in the sales column, it shows us the cost of goods sold. For example, if a company buys shirts from a supplier and then sells shirts to different customers, now he bought 500 shirts, and every shirt was priced at Rs. 500, so he got Rs. 250000, and this Rs. 250000 will be the total cost in the procurement table, . Now, he sold products to different customers. For example, he sold each product at the cost of Rs. 700, and he sold 500 products. Then the total revenue generated would be equal to 700 * 500 = 350000, now, from this 350,000 amount, the cost of making this product would be equal to 250,000. In this case, 250000 will be the total cost in the sales table. And this cost is actually the cost of goods sold. it is also true if we have the same number of purchasing and the same number of buying, then the cost of goods sold in the sales table (i.e., the total cost in the sales table) will be equal to the total cost in the procurement table, But this is not always 100% right due to some taxes, purchase discounts etc etc   </w:t>
+      </w:r>
+    </w:p>
+    <w:p>
+      <w:pPr>
+        <w:rPr>
+          <w:sz w:val="24"/>
+          <w:szCs w:val="24"/>
+          <w:lang w:val="en-PK"/>
+        </w:rPr>
+      </w:pPr>
+      <w:r>
+        <w:rPr>
+          <w:sz w:val="24"/>
+          <w:szCs w:val="24"/>
+          <w:lang w:val="en-PK"/>
+        </w:rPr>
+        <w:t xml:space="preserve">The stock column and safety stock column in the inventory table are different from each other. </w:t>
+      </w:r>
+    </w:p>
+    <w:p>
+      <w:pPr>
+        <w:numPr>
+          <w:ilvl w:val="0"/>
+          <w:numId w:val="3"/>
+        </w:numPr>
+        <w:rPr>
+          <w:sz w:val="24"/>
+          <w:szCs w:val="24"/>
+          <w:lang w:val="en-PK"/>
+        </w:rPr>
+      </w:pPr>
+      <w:r>
+        <w:rPr>
+          <w:sz w:val="24"/>
+          <w:szCs w:val="24"/>
+          <w:lang w:val="en-PK"/>
+        </w:rPr>
+        <w:t>The stock column tells how much inventory or stock is currently available in the inventory or in our store</w:t>
+      </w:r>
+    </w:p>
+    <w:p>
+      <w:pPr>
+        <w:numPr>
+          <w:ilvl w:val="0"/>
+          <w:numId w:val="3"/>
+        </w:numPr>
+        <w:pBdr>
+          <w:bottom w:val="single" w:sz="6" w:space="1" w:color="auto"/>
+        </w:pBdr>
+        <w:rPr>
+          <w:sz w:val="24"/>
+          <w:szCs w:val="24"/>
+          <w:lang w:val="en-PK"/>
+        </w:rPr>
+      </w:pPr>
+      <w:r>
+        <w:rPr>
+          <w:sz w:val="24"/>
+          <w:szCs w:val="24"/>
+          <w:lang w:val="en-PK"/>
+        </w:rPr>
+        <w:t>The safety stock level tells how much stock we should always keep in our inventory to prevent shock outs</w:t>
+      </w:r>
+    </w:p>
+    <w:p>
+      <w:pPr>
+        <w:rPr>
+          <w:sz w:val="24"/>
+          <w:szCs w:val="24"/>
+        </w:rPr>
+      </w:pPr>
+    </w:p>
+    <w:p>
+      <w:pPr>
+        <w:rPr>
+          <w:sz w:val="24"/>
+          <w:szCs w:val="24"/>
+        </w:rPr>
+      </w:pPr>
+      <w:r>
+        <w:rPr>
+          <w:sz w:val="24"/>
+          <w:szCs w:val="24"/>
+        </w:rPr>
         <w:t>Measures we have generated:</w:t>
       </w:r>
     </w:p>
     <w:p>
       <w:pPr>
+        <w:pStyle w:val="ListParagraph"/>
+        <w:numPr>
+          <w:ilvl w:val="0"/>
+          <w:numId w:val="3"/>
+        </w:numPr>
         <w:rPr>
           <w:sz w:val="24"/>
           <w:szCs w:val="24"/>
@@ -1877,6 +927,11 @@
     </w:p>
     <w:p>
       <w:pPr>
+        <w:pStyle w:val="ListParagraph"/>
+        <w:numPr>
+          <w:ilvl w:val="0"/>
+          <w:numId w:val="3"/>
+        </w:numPr>
         <w:rPr>
           <w:sz w:val="24"/>
           <w:szCs w:val="24"/>
@@ -1892,6 +947,11 @@
     </w:p>
     <w:p>
       <w:pPr>
+        <w:pStyle w:val="ListParagraph"/>
+        <w:numPr>
+          <w:ilvl w:val="0"/>
+          <w:numId w:val="3"/>
+        </w:numPr>
         <w:rPr>
           <w:sz w:val="24"/>
           <w:szCs w:val="24"/>
@@ -1907,27 +967,180 @@
     </w:p>
     <w:p>
       <w:pPr>
-        <w:rPr>
-          <w:sz w:val="24"/>
-          <w:szCs w:val="24"/>
-        </w:rPr>
-      </w:pPr>
-      <w:proofErr w:type="spellStart"/>
-      <w:r>
-        <w:rPr>
-          <w:sz w:val="24"/>
-          <w:szCs w:val="24"/>
-        </w:rPr>
-        <w:t>Toyal</w:t>
-      </w:r>
-      <w:proofErr w:type="spellEnd"/>
-      <w:r>
-        <w:rPr>
-          <w:sz w:val="24"/>
-          <w:szCs w:val="24"/>
-        </w:rPr>
-        <w:t xml:space="preserve"> quantity sold</w:t>
-      </w:r>
+        <w:pStyle w:val="ListParagraph"/>
+        <w:numPr>
+          <w:ilvl w:val="0"/>
+          <w:numId w:val="3"/>
+        </w:numPr>
+        <w:rPr>
+          <w:sz w:val="24"/>
+          <w:szCs w:val="24"/>
+        </w:rPr>
+      </w:pPr>
+      <w:r>
+        <w:rPr>
+          <w:sz w:val="24"/>
+          <w:szCs w:val="24"/>
+        </w:rPr>
+        <w:t>To</w:t>
+      </w:r>
+      <w:r>
+        <w:rPr>
+          <w:sz w:val="24"/>
+          <w:szCs w:val="24"/>
+        </w:rPr>
+        <w:t>t</w:t>
+      </w:r>
+      <w:r>
+        <w:rPr>
+          <w:sz w:val="24"/>
+          <w:szCs w:val="24"/>
+        </w:rPr>
+        <w:t>al quantity sold</w:t>
+      </w:r>
+    </w:p>
+    <w:p>
+      <w:pPr>
+        <w:pStyle w:val="ListParagraph"/>
+        <w:numPr>
+          <w:ilvl w:val="0"/>
+          <w:numId w:val="3"/>
+        </w:numPr>
+        <w:rPr>
+          <w:sz w:val="24"/>
+          <w:szCs w:val="24"/>
+        </w:rPr>
+      </w:pPr>
+      <w:r>
+        <w:rPr>
+          <w:sz w:val="24"/>
+          <w:szCs w:val="24"/>
+        </w:rPr>
+        <w:t>Inventory value</w:t>
+      </w:r>
+    </w:p>
+    <w:p>
+      <w:pPr>
+        <w:pStyle w:val="ListParagraph"/>
+        <w:numPr>
+          <w:ilvl w:val="0"/>
+          <w:numId w:val="3"/>
+        </w:numPr>
+        <w:rPr>
+          <w:sz w:val="24"/>
+          <w:szCs w:val="24"/>
+        </w:rPr>
+      </w:pPr>
+      <w:r>
+        <w:rPr>
+          <w:sz w:val="24"/>
+          <w:szCs w:val="24"/>
+        </w:rPr>
+        <w:t>Average_lead_time (order place hony s le kr product k receive hiny tk ka time)</w:t>
+      </w:r>
+    </w:p>
+    <w:p>
+      <w:pPr>
+        <w:pStyle w:val="ListParagraph"/>
+        <w:numPr>
+          <w:ilvl w:val="0"/>
+          <w:numId w:val="3"/>
+        </w:numPr>
+        <w:rPr>
+          <w:sz w:val="24"/>
+          <w:szCs w:val="24"/>
+        </w:rPr>
+      </w:pPr>
+      <w:r>
+        <w:rPr>
+          <w:sz w:val="24"/>
+          <w:szCs w:val="24"/>
+        </w:rPr>
+        <w:t>Total_shipment (sum of all orders)</w:t>
+      </w:r>
+    </w:p>
+    <w:p>
+      <w:pPr>
+        <w:pStyle w:val="ListParagraph"/>
+        <w:numPr>
+          <w:ilvl w:val="0"/>
+          <w:numId w:val="3"/>
+        </w:numPr>
+        <w:rPr>
+          <w:sz w:val="24"/>
+          <w:szCs w:val="24"/>
+        </w:rPr>
+      </w:pPr>
+      <w:r>
+        <w:rPr>
+          <w:sz w:val="24"/>
+          <w:szCs w:val="24"/>
+        </w:rPr>
+        <w:t>Perfect order percentage (yani vo products jo k defected bhu nhi th and vo successfully delieved ho gay customer tk)</w:t>
+      </w:r>
+    </w:p>
+    <w:p>
+      <w:pPr>
+        <w:pStyle w:val="ListParagraph"/>
+        <w:numPr>
+          <w:ilvl w:val="0"/>
+          <w:numId w:val="3"/>
+        </w:numPr>
+        <w:rPr>
+          <w:sz w:val="24"/>
+          <w:szCs w:val="24"/>
+        </w:rPr>
+      </w:pPr>
+      <w:r>
+        <w:rPr>
+          <w:sz w:val="24"/>
+          <w:szCs w:val="24"/>
+        </w:rPr>
+        <w:t>Total sales cost  (</w:t>
+      </w:r>
+      <w:r>
+        <w:rPr>
+          <w:sz w:val="24"/>
+          <w:szCs w:val="24"/>
+        </w:rPr>
+        <w:t xml:space="preserve">we should sum the total cost from the sales table instead of the procurement table. </w:t>
+      </w:r>
+      <w:r>
+        <w:rPr>
+          <w:sz w:val="24"/>
+          <w:szCs w:val="24"/>
+        </w:rPr>
+        <w:t xml:space="preserve">The lecturer is using total cost sum from the procurement table, which is not correct because the procurement table's cost or sales table's total </w:t>
+      </w:r>
+      <w:r>
+        <w:rPr>
+          <w:sz w:val="24"/>
+          <w:szCs w:val="24"/>
+        </w:rPr>
+        <w:t xml:space="preserve">in </w:t>
+      </w:r>
+      <w:r>
+        <w:rPr>
+          <w:sz w:val="24"/>
+          <w:szCs w:val="24"/>
+        </w:rPr>
+        <w:t>mostly cases, it is different due to taxes and discounts, etc., so to calculate total sales cost, we should use the sum of the total cost column from the sales table instead of the procurement table</w:t>
+      </w:r>
+      <w:r>
+        <w:rPr>
+          <w:sz w:val="24"/>
+          <w:szCs w:val="24"/>
+        </w:rPr>
+        <w:t>)</w:t>
+      </w:r>
+    </w:p>
+    <w:p>
+      <w:pPr>
+        <w:rPr>
+          <w:sz w:val="24"/>
+          <w:szCs w:val="24"/>
+        </w:rPr>
+      </w:pPr>
     </w:p>
     <w:p>
       <w:pPr>
@@ -2175,11 +1388,163 @@
       </w:pPr>
     </w:lvl>
   </w:abstractNum>
+  <w:abstractNum w:abstractNumId="2" w15:restartNumberingAfterBreak="0">
+    <w:nsid w:val="61FE14EA"/>
+    <w:multiLevelType w:val="multilevel"/>
+    <w:tmpl w:val="1EE0C784"/>
+    <w:lvl w:ilvl="0">
+      <w:start w:val="1"/>
+      <w:numFmt w:val="bullet"/>
+      <w:lvlText w:val=""/>
+      <w:lvlJc w:val="left"/>
+      <w:pPr>
+        <w:tabs>
+          <w:tab w:val="num" w:pos="720"/>
+        </w:tabs>
+        <w:ind w:left="720" w:hanging="360"/>
+      </w:pPr>
+      <w:rPr>
+        <w:rFonts w:ascii="Symbol" w:hAnsi="Symbol" w:hint="default"/>
+        <w:sz w:val="20"/>
+      </w:rPr>
+    </w:lvl>
+    <w:lvl w:ilvl="1" w:tentative="1">
+      <w:start w:val="1"/>
+      <w:numFmt w:val="bullet"/>
+      <w:lvlText w:val="o"/>
+      <w:lvlJc w:val="left"/>
+      <w:pPr>
+        <w:tabs>
+          <w:tab w:val="num" w:pos="1440"/>
+        </w:tabs>
+        <w:ind w:left="1440" w:hanging="360"/>
+      </w:pPr>
+      <w:rPr>
+        <w:rFonts w:ascii="Courier New" w:hAnsi="Courier New" w:hint="default"/>
+        <w:sz w:val="20"/>
+      </w:rPr>
+    </w:lvl>
+    <w:lvl w:ilvl="2" w:tentative="1">
+      <w:start w:val="1"/>
+      <w:numFmt w:val="bullet"/>
+      <w:lvlText w:val=""/>
+      <w:lvlJc w:val="left"/>
+      <w:pPr>
+        <w:tabs>
+          <w:tab w:val="num" w:pos="2160"/>
+        </w:tabs>
+        <w:ind w:left="2160" w:hanging="360"/>
+      </w:pPr>
+      <w:rPr>
+        <w:rFonts w:ascii="Wingdings" w:hAnsi="Wingdings" w:hint="default"/>
+        <w:sz w:val="20"/>
+      </w:rPr>
+    </w:lvl>
+    <w:lvl w:ilvl="3" w:tentative="1">
+      <w:start w:val="1"/>
+      <w:numFmt w:val="bullet"/>
+      <w:lvlText w:val=""/>
+      <w:lvlJc w:val="left"/>
+      <w:pPr>
+        <w:tabs>
+          <w:tab w:val="num" w:pos="2880"/>
+        </w:tabs>
+        <w:ind w:left="2880" w:hanging="360"/>
+      </w:pPr>
+      <w:rPr>
+        <w:rFonts w:ascii="Wingdings" w:hAnsi="Wingdings" w:hint="default"/>
+        <w:sz w:val="20"/>
+      </w:rPr>
+    </w:lvl>
+    <w:lvl w:ilvl="4" w:tentative="1">
+      <w:start w:val="1"/>
+      <w:numFmt w:val="bullet"/>
+      <w:lvlText w:val=""/>
+      <w:lvlJc w:val="left"/>
+      <w:pPr>
+        <w:tabs>
+          <w:tab w:val="num" w:pos="3600"/>
+        </w:tabs>
+        <w:ind w:left="3600" w:hanging="360"/>
+      </w:pPr>
+      <w:rPr>
+        <w:rFonts w:ascii="Wingdings" w:hAnsi="Wingdings" w:hint="default"/>
+        <w:sz w:val="20"/>
+      </w:rPr>
+    </w:lvl>
+    <w:lvl w:ilvl="5" w:tentative="1">
+      <w:start w:val="1"/>
+      <w:numFmt w:val="bullet"/>
+      <w:lvlText w:val=""/>
+      <w:lvlJc w:val="left"/>
+      <w:pPr>
+        <w:tabs>
+          <w:tab w:val="num" w:pos="4320"/>
+        </w:tabs>
+        <w:ind w:left="4320" w:hanging="360"/>
+      </w:pPr>
+      <w:rPr>
+        <w:rFonts w:ascii="Wingdings" w:hAnsi="Wingdings" w:hint="default"/>
+        <w:sz w:val="20"/>
+      </w:rPr>
+    </w:lvl>
+    <w:lvl w:ilvl="6" w:tentative="1">
+      <w:start w:val="1"/>
+      <w:numFmt w:val="bullet"/>
+      <w:lvlText w:val=""/>
+      <w:lvlJc w:val="left"/>
+      <w:pPr>
+        <w:tabs>
+          <w:tab w:val="num" w:pos="5040"/>
+        </w:tabs>
+        <w:ind w:left="5040" w:hanging="360"/>
+      </w:pPr>
+      <w:rPr>
+        <w:rFonts w:ascii="Wingdings" w:hAnsi="Wingdings" w:hint="default"/>
+        <w:sz w:val="20"/>
+      </w:rPr>
+    </w:lvl>
+    <w:lvl w:ilvl="7" w:tentative="1">
+      <w:start w:val="1"/>
+      <w:numFmt w:val="bullet"/>
+      <w:lvlText w:val=""/>
+      <w:lvlJc w:val="left"/>
+      <w:pPr>
+        <w:tabs>
+          <w:tab w:val="num" w:pos="5760"/>
+        </w:tabs>
+        <w:ind w:left="5760" w:hanging="360"/>
+      </w:pPr>
+      <w:rPr>
+        <w:rFonts w:ascii="Wingdings" w:hAnsi="Wingdings" w:hint="default"/>
+        <w:sz w:val="20"/>
+      </w:rPr>
+    </w:lvl>
+    <w:lvl w:ilvl="8" w:tentative="1">
+      <w:start w:val="1"/>
+      <w:numFmt w:val="bullet"/>
+      <w:lvlText w:val=""/>
+      <w:lvlJc w:val="left"/>
+      <w:pPr>
+        <w:tabs>
+          <w:tab w:val="num" w:pos="6480"/>
+        </w:tabs>
+        <w:ind w:left="6480" w:hanging="360"/>
+      </w:pPr>
+      <w:rPr>
+        <w:rFonts w:ascii="Wingdings" w:hAnsi="Wingdings" w:hint="default"/>
+        <w:sz w:val="20"/>
+      </w:rPr>
+    </w:lvl>
+  </w:abstractNum>
   <w:num w:numId="1" w16cid:durableId="89325607">
     <w:abstractNumId w:val="0"/>
   </w:num>
   <w:num w:numId="2" w16cid:durableId="810094480">
     <w:abstractNumId w:val="1"/>
+  </w:num>
+  <w:num w:numId="3" w16cid:durableId="1646738463">
+    <w:abstractNumId w:val="2"/>
   </w:num>
 </w:numbering>
 </file>

</xml_diff>

<commit_message>
start creating separate analysis for all supply chain elements
</commit_message>
<xml_diff>
--- a/learning_material_of supply chain analysis.docx
+++ b/learning_material_of supply chain analysis.docx
@@ -34,8 +34,65 @@
           <w:sz w:val="24"/>
           <w:szCs w:val="24"/>
         </w:rPr>
-        <w:t>Company m ek chain ki trah kaam hota h from the production of the product to its delievery</w:t>
-      </w:r>
+        <w:t xml:space="preserve">Company m ek chain ki </w:t>
+      </w:r>
+      <w:proofErr w:type="spellStart"/>
+      <w:r>
+        <w:rPr>
+          <w:sz w:val="24"/>
+          <w:szCs w:val="24"/>
+        </w:rPr>
+        <w:t>trah</w:t>
+      </w:r>
+      <w:proofErr w:type="spellEnd"/>
+      <w:r>
+        <w:rPr>
+          <w:sz w:val="24"/>
+          <w:szCs w:val="24"/>
+        </w:rPr>
+        <w:t xml:space="preserve"> </w:t>
+      </w:r>
+      <w:proofErr w:type="spellStart"/>
+      <w:r>
+        <w:rPr>
+          <w:sz w:val="24"/>
+          <w:szCs w:val="24"/>
+        </w:rPr>
+        <w:t>kaam</w:t>
+      </w:r>
+      <w:proofErr w:type="spellEnd"/>
+      <w:r>
+        <w:rPr>
+          <w:sz w:val="24"/>
+          <w:szCs w:val="24"/>
+        </w:rPr>
+        <w:t xml:space="preserve"> </w:t>
+      </w:r>
+      <w:proofErr w:type="spellStart"/>
+      <w:r>
+        <w:rPr>
+          <w:sz w:val="24"/>
+          <w:szCs w:val="24"/>
+        </w:rPr>
+        <w:t>hota</w:t>
+      </w:r>
+      <w:proofErr w:type="spellEnd"/>
+      <w:r>
+        <w:rPr>
+          <w:sz w:val="24"/>
+          <w:szCs w:val="24"/>
+        </w:rPr>
+        <w:t xml:space="preserve"> h from the production of the product to its </w:t>
+      </w:r>
+      <w:proofErr w:type="spellStart"/>
+      <w:r>
+        <w:rPr>
+          <w:sz w:val="24"/>
+          <w:szCs w:val="24"/>
+        </w:rPr>
+        <w:t>delievery</w:t>
+      </w:r>
+      <w:proofErr w:type="spellEnd"/>
       <w:r>
         <w:rPr>
           <w:sz w:val="24"/>
@@ -267,7 +324,23 @@
           <w:sz w:val="24"/>
           <w:szCs w:val="24"/>
         </w:rPr>
-        <w:t xml:space="preserve"> We also determine how many products are entrying the inventory and how many going out. </w:t>
+        <w:t xml:space="preserve"> We also determine how many products are </w:t>
+      </w:r>
+      <w:proofErr w:type="spellStart"/>
+      <w:r>
+        <w:rPr>
+          <w:sz w:val="24"/>
+          <w:szCs w:val="24"/>
+        </w:rPr>
+        <w:t>entrying</w:t>
+      </w:r>
+      <w:proofErr w:type="spellEnd"/>
+      <w:r>
+        <w:rPr>
+          <w:sz w:val="24"/>
+          <w:szCs w:val="24"/>
+        </w:rPr>
+        <w:t xml:space="preserve"> the inventory and how many going out. </w:t>
       </w:r>
       <w:r>
         <w:rPr>
@@ -281,7 +354,167 @@
           <w:sz w:val="24"/>
           <w:szCs w:val="24"/>
         </w:rPr>
-        <w:t>, yani mazeed y baat dekhni k mazeed kitni products bnani h y logistics k under nhi ayta, y supply chain k under ata h</w:t>
+        <w:t xml:space="preserve">, </w:t>
+      </w:r>
+      <w:proofErr w:type="spellStart"/>
+      <w:r>
+        <w:rPr>
+          <w:sz w:val="24"/>
+          <w:szCs w:val="24"/>
+        </w:rPr>
+        <w:t>yani</w:t>
+      </w:r>
+      <w:proofErr w:type="spellEnd"/>
+      <w:r>
+        <w:rPr>
+          <w:sz w:val="24"/>
+          <w:szCs w:val="24"/>
+        </w:rPr>
+        <w:t xml:space="preserve"> </w:t>
+      </w:r>
+      <w:proofErr w:type="spellStart"/>
+      <w:r>
+        <w:rPr>
+          <w:sz w:val="24"/>
+          <w:szCs w:val="24"/>
+        </w:rPr>
+        <w:t>mazeed</w:t>
+      </w:r>
+      <w:proofErr w:type="spellEnd"/>
+      <w:r>
+        <w:rPr>
+          <w:sz w:val="24"/>
+          <w:szCs w:val="24"/>
+        </w:rPr>
+        <w:t xml:space="preserve"> y </w:t>
+      </w:r>
+      <w:proofErr w:type="spellStart"/>
+      <w:r>
+        <w:rPr>
+          <w:sz w:val="24"/>
+          <w:szCs w:val="24"/>
+        </w:rPr>
+        <w:t>baat</w:t>
+      </w:r>
+      <w:proofErr w:type="spellEnd"/>
+      <w:r>
+        <w:rPr>
+          <w:sz w:val="24"/>
+          <w:szCs w:val="24"/>
+        </w:rPr>
+        <w:t xml:space="preserve"> </w:t>
+      </w:r>
+      <w:proofErr w:type="spellStart"/>
+      <w:r>
+        <w:rPr>
+          <w:sz w:val="24"/>
+          <w:szCs w:val="24"/>
+        </w:rPr>
+        <w:t>dekhni</w:t>
+      </w:r>
+      <w:proofErr w:type="spellEnd"/>
+      <w:r>
+        <w:rPr>
+          <w:sz w:val="24"/>
+          <w:szCs w:val="24"/>
+        </w:rPr>
+        <w:t xml:space="preserve"> k </w:t>
+      </w:r>
+      <w:proofErr w:type="spellStart"/>
+      <w:r>
+        <w:rPr>
+          <w:sz w:val="24"/>
+          <w:szCs w:val="24"/>
+        </w:rPr>
+        <w:t>mazeed</w:t>
+      </w:r>
+      <w:proofErr w:type="spellEnd"/>
+      <w:r>
+        <w:rPr>
+          <w:sz w:val="24"/>
+          <w:szCs w:val="24"/>
+        </w:rPr>
+        <w:t xml:space="preserve"> </w:t>
+      </w:r>
+      <w:proofErr w:type="spellStart"/>
+      <w:r>
+        <w:rPr>
+          <w:sz w:val="24"/>
+          <w:szCs w:val="24"/>
+        </w:rPr>
+        <w:t>kitni</w:t>
+      </w:r>
+      <w:proofErr w:type="spellEnd"/>
+      <w:r>
+        <w:rPr>
+          <w:sz w:val="24"/>
+          <w:szCs w:val="24"/>
+        </w:rPr>
+        <w:t xml:space="preserve"> products </w:t>
+      </w:r>
+      <w:proofErr w:type="spellStart"/>
+      <w:r>
+        <w:rPr>
+          <w:sz w:val="24"/>
+          <w:szCs w:val="24"/>
+        </w:rPr>
+        <w:t>bnani</w:t>
+      </w:r>
+      <w:proofErr w:type="spellEnd"/>
+      <w:r>
+        <w:rPr>
+          <w:sz w:val="24"/>
+          <w:szCs w:val="24"/>
+        </w:rPr>
+        <w:t xml:space="preserve"> h y logistics k under </w:t>
+      </w:r>
+      <w:proofErr w:type="spellStart"/>
+      <w:r>
+        <w:rPr>
+          <w:sz w:val="24"/>
+          <w:szCs w:val="24"/>
+        </w:rPr>
+        <w:t>nhi</w:t>
+      </w:r>
+      <w:proofErr w:type="spellEnd"/>
+      <w:r>
+        <w:rPr>
+          <w:sz w:val="24"/>
+          <w:szCs w:val="24"/>
+        </w:rPr>
+        <w:t xml:space="preserve"> </w:t>
+      </w:r>
+      <w:proofErr w:type="spellStart"/>
+      <w:r>
+        <w:rPr>
+          <w:sz w:val="24"/>
+          <w:szCs w:val="24"/>
+        </w:rPr>
+        <w:t>ayta</w:t>
+      </w:r>
+      <w:proofErr w:type="spellEnd"/>
+      <w:r>
+        <w:rPr>
+          <w:sz w:val="24"/>
+          <w:szCs w:val="24"/>
+        </w:rPr>
+        <w:t xml:space="preserve">, y supply chain k under </w:t>
+      </w:r>
+      <w:proofErr w:type="spellStart"/>
+      <w:r>
+        <w:rPr>
+          <w:sz w:val="24"/>
+          <w:szCs w:val="24"/>
+        </w:rPr>
+        <w:t>ata</w:t>
+      </w:r>
+      <w:proofErr w:type="spellEnd"/>
+      <w:r>
+        <w:rPr>
+          <w:sz w:val="24"/>
+          <w:szCs w:val="24"/>
+        </w:rPr>
+        <w:t xml:space="preserve"> h</w:t>
       </w:r>
     </w:p>
     <w:p>
@@ -323,7 +556,23 @@
           <w:sz w:val="24"/>
           <w:szCs w:val="24"/>
         </w:rPr>
-        <w:t>When we load our data to PowerQE editor, all the files are present in a specific file location. For example, each file in the dataset has a specific location. When we transfer or when we send this project to someone else, the files' location</w:t>
+        <w:t xml:space="preserve">When we load our data to </w:t>
+      </w:r>
+      <w:proofErr w:type="spellStart"/>
+      <w:r>
+        <w:rPr>
+          <w:sz w:val="24"/>
+          <w:szCs w:val="24"/>
+        </w:rPr>
+        <w:t>PowerQE</w:t>
+      </w:r>
+      <w:proofErr w:type="spellEnd"/>
+      <w:r>
+        <w:rPr>
+          <w:sz w:val="24"/>
+          <w:szCs w:val="24"/>
+        </w:rPr>
+        <w:t xml:space="preserve"> editor, all the files are present in a specific file location. For example, each file in the dataset has a specific location. When we transfer or when we send this project to someone else, the files' location</w:t>
       </w:r>
       <w:r>
         <w:rPr>
@@ -365,7 +614,23 @@
           <w:sz w:val="24"/>
           <w:szCs w:val="24"/>
         </w:rPr>
-        <w:t xml:space="preserve"> from the dataset files location that is present in their computer. As a result, he cannot use the project; it will generate an error because PowerQE editor is trying to look at the location that is present in the project</w:t>
+        <w:t xml:space="preserve"> from the dataset files location that is present in their computer. As a result, he cannot use the project; it will generate an error because </w:t>
+      </w:r>
+      <w:proofErr w:type="spellStart"/>
+      <w:r>
+        <w:rPr>
+          <w:sz w:val="24"/>
+          <w:szCs w:val="24"/>
+        </w:rPr>
+        <w:t>PowerQE</w:t>
+      </w:r>
+      <w:proofErr w:type="spellEnd"/>
+      <w:r>
+        <w:rPr>
+          <w:sz w:val="24"/>
+          <w:szCs w:val="24"/>
+        </w:rPr>
+        <w:t xml:space="preserve"> editor is trying to look at the location that is present in the project</w:t>
       </w:r>
       <w:r>
         <w:rPr>
@@ -428,14 +693,206 @@
           <w:sz w:val="24"/>
           <w:szCs w:val="24"/>
         </w:rPr>
-        <w:t xml:space="preserve">, if we don’t use this feature, then receiver ko hr hr data file k liye source m ja kr </w:t>
-      </w:r>
-      <w:r>
-        <w:rPr>
-          <w:sz w:val="24"/>
-          <w:szCs w:val="24"/>
-        </w:rPr>
-        <w:t>file ka new path dena pry ga, agr hm y feature use kr lety hn to usy just ek hi jga dena pry ga new file location ko</w:t>
+        <w:t xml:space="preserve">, if we don’t use this feature, then receiver ko </w:t>
+      </w:r>
+      <w:proofErr w:type="spellStart"/>
+      <w:r>
+        <w:rPr>
+          <w:sz w:val="24"/>
+          <w:szCs w:val="24"/>
+        </w:rPr>
+        <w:t>hr</w:t>
+      </w:r>
+      <w:proofErr w:type="spellEnd"/>
+      <w:r>
+        <w:rPr>
+          <w:sz w:val="24"/>
+          <w:szCs w:val="24"/>
+        </w:rPr>
+        <w:t xml:space="preserve"> </w:t>
+      </w:r>
+      <w:proofErr w:type="spellStart"/>
+      <w:r>
+        <w:rPr>
+          <w:sz w:val="24"/>
+          <w:szCs w:val="24"/>
+        </w:rPr>
+        <w:t>hr</w:t>
+      </w:r>
+      <w:proofErr w:type="spellEnd"/>
+      <w:r>
+        <w:rPr>
+          <w:sz w:val="24"/>
+          <w:szCs w:val="24"/>
+        </w:rPr>
+        <w:t xml:space="preserve"> data file k </w:t>
+      </w:r>
+      <w:proofErr w:type="spellStart"/>
+      <w:r>
+        <w:rPr>
+          <w:sz w:val="24"/>
+          <w:szCs w:val="24"/>
+        </w:rPr>
+        <w:t>liye</w:t>
+      </w:r>
+      <w:proofErr w:type="spellEnd"/>
+      <w:r>
+        <w:rPr>
+          <w:sz w:val="24"/>
+          <w:szCs w:val="24"/>
+        </w:rPr>
+        <w:t xml:space="preserve"> source m ja </w:t>
+      </w:r>
+      <w:proofErr w:type="spellStart"/>
+      <w:r>
+        <w:rPr>
+          <w:sz w:val="24"/>
+          <w:szCs w:val="24"/>
+        </w:rPr>
+        <w:t>kr</w:t>
+      </w:r>
+      <w:proofErr w:type="spellEnd"/>
+      <w:r>
+        <w:rPr>
+          <w:sz w:val="24"/>
+          <w:szCs w:val="24"/>
+        </w:rPr>
+        <w:t xml:space="preserve"> </w:t>
+      </w:r>
+      <w:r>
+        <w:rPr>
+          <w:sz w:val="24"/>
+          <w:szCs w:val="24"/>
+        </w:rPr>
+        <w:t xml:space="preserve">file ka new path </w:t>
+      </w:r>
+      <w:proofErr w:type="spellStart"/>
+      <w:r>
+        <w:rPr>
+          <w:sz w:val="24"/>
+          <w:szCs w:val="24"/>
+        </w:rPr>
+        <w:t>dena</w:t>
+      </w:r>
+      <w:proofErr w:type="spellEnd"/>
+      <w:r>
+        <w:rPr>
+          <w:sz w:val="24"/>
+          <w:szCs w:val="24"/>
+        </w:rPr>
+        <w:t xml:space="preserve"> pry ga, </w:t>
+      </w:r>
+      <w:proofErr w:type="spellStart"/>
+      <w:r>
+        <w:rPr>
+          <w:sz w:val="24"/>
+          <w:szCs w:val="24"/>
+        </w:rPr>
+        <w:t>agr</w:t>
+      </w:r>
+      <w:proofErr w:type="spellEnd"/>
+      <w:r>
+        <w:rPr>
+          <w:sz w:val="24"/>
+          <w:szCs w:val="24"/>
+        </w:rPr>
+        <w:t xml:space="preserve"> hm y feature use </w:t>
+      </w:r>
+      <w:proofErr w:type="spellStart"/>
+      <w:r>
+        <w:rPr>
+          <w:sz w:val="24"/>
+          <w:szCs w:val="24"/>
+        </w:rPr>
+        <w:t>kr</w:t>
+      </w:r>
+      <w:proofErr w:type="spellEnd"/>
+      <w:r>
+        <w:rPr>
+          <w:sz w:val="24"/>
+          <w:szCs w:val="24"/>
+        </w:rPr>
+        <w:t xml:space="preserve"> </w:t>
+      </w:r>
+      <w:proofErr w:type="spellStart"/>
+      <w:r>
+        <w:rPr>
+          <w:sz w:val="24"/>
+          <w:szCs w:val="24"/>
+        </w:rPr>
+        <w:t>lety</w:t>
+      </w:r>
+      <w:proofErr w:type="spellEnd"/>
+      <w:r>
+        <w:rPr>
+          <w:sz w:val="24"/>
+          <w:szCs w:val="24"/>
+        </w:rPr>
+        <w:t xml:space="preserve"> </w:t>
+      </w:r>
+      <w:proofErr w:type="spellStart"/>
+      <w:r>
+        <w:rPr>
+          <w:sz w:val="24"/>
+          <w:szCs w:val="24"/>
+        </w:rPr>
+        <w:t>hn</w:t>
+      </w:r>
+      <w:proofErr w:type="spellEnd"/>
+      <w:r>
+        <w:rPr>
+          <w:sz w:val="24"/>
+          <w:szCs w:val="24"/>
+        </w:rPr>
+        <w:t xml:space="preserve"> to </w:t>
+      </w:r>
+      <w:proofErr w:type="spellStart"/>
+      <w:r>
+        <w:rPr>
+          <w:sz w:val="24"/>
+          <w:szCs w:val="24"/>
+        </w:rPr>
+        <w:t>usy</w:t>
+      </w:r>
+      <w:proofErr w:type="spellEnd"/>
+      <w:r>
+        <w:rPr>
+          <w:sz w:val="24"/>
+          <w:szCs w:val="24"/>
+        </w:rPr>
+        <w:t xml:space="preserve"> just ek hi </w:t>
+      </w:r>
+      <w:proofErr w:type="spellStart"/>
+      <w:r>
+        <w:rPr>
+          <w:sz w:val="24"/>
+          <w:szCs w:val="24"/>
+        </w:rPr>
+        <w:t>jga</w:t>
+      </w:r>
+      <w:proofErr w:type="spellEnd"/>
+      <w:r>
+        <w:rPr>
+          <w:sz w:val="24"/>
+          <w:szCs w:val="24"/>
+        </w:rPr>
+        <w:t xml:space="preserve"> </w:t>
+      </w:r>
+      <w:proofErr w:type="spellStart"/>
+      <w:r>
+        <w:rPr>
+          <w:sz w:val="24"/>
+          <w:szCs w:val="24"/>
+        </w:rPr>
+        <w:t>dena</w:t>
+      </w:r>
+      <w:proofErr w:type="spellEnd"/>
+      <w:r>
+        <w:rPr>
+          <w:sz w:val="24"/>
+          <w:szCs w:val="24"/>
+        </w:rPr>
+        <w:t xml:space="preserve"> pry ga new file location ko</w:t>
       </w:r>
     </w:p>
     <w:p>
@@ -585,14 +1042,46 @@
           <w:sz w:val="24"/>
           <w:szCs w:val="24"/>
         </w:rPr>
-        <w:t xml:space="preserve">In the left side of PowerQri editor where the names of all dataset files are shown, there is another folder, or, as it is shown as file names, a file named 'folder path' will be shown. Now, in the dataset where all files' names are present, </w:t>
-      </w:r>
-      <w:r>
-        <w:rPr>
-          <w:sz w:val="24"/>
-          <w:szCs w:val="24"/>
-        </w:rPr>
-        <w:t>jo k sab s upper show hoti h</w:t>
+        <w:t xml:space="preserve">In the left side of </w:t>
+      </w:r>
+      <w:proofErr w:type="spellStart"/>
+      <w:r>
+        <w:rPr>
+          <w:sz w:val="24"/>
+          <w:szCs w:val="24"/>
+        </w:rPr>
+        <w:t>PowerQri</w:t>
+      </w:r>
+      <w:proofErr w:type="spellEnd"/>
+      <w:r>
+        <w:rPr>
+          <w:sz w:val="24"/>
+          <w:szCs w:val="24"/>
+        </w:rPr>
+        <w:t xml:space="preserve"> editor where the names of all dataset files are shown, there is another folder, or, as it is shown as file names, a file named 'folder path' will be shown. Now, in the dataset where all files' names are present, </w:t>
+      </w:r>
+      <w:r>
+        <w:rPr>
+          <w:sz w:val="24"/>
+          <w:szCs w:val="24"/>
+        </w:rPr>
+        <w:t xml:space="preserve">jo k sab s upper show </w:t>
+      </w:r>
+      <w:proofErr w:type="spellStart"/>
+      <w:r>
+        <w:rPr>
+          <w:sz w:val="24"/>
+          <w:szCs w:val="24"/>
+        </w:rPr>
+        <w:t>hoti</w:t>
+      </w:r>
+      <w:proofErr w:type="spellEnd"/>
+      <w:r>
+        <w:rPr>
+          <w:sz w:val="24"/>
+          <w:szCs w:val="24"/>
+        </w:rPr>
+        <w:t xml:space="preserve"> h</w:t>
       </w:r>
       <w:r>
         <w:rPr>
@@ -685,7 +1174,295 @@
           <w:sz w:val="24"/>
           <w:szCs w:val="24"/>
         </w:rPr>
-        <w:t xml:space="preserve">Now we will go to each file dim_customer, dim_date etc etc and applied steps m navigation m ja kr upper jahn folder path p[ura mention h commas k andr, us ko hta kr just folder path likh den gy, or esa hm hr hr data file k saath kryn gy, </w:t>
+        <w:t xml:space="preserve">Now we will go to each file </w:t>
+      </w:r>
+      <w:proofErr w:type="spellStart"/>
+      <w:r>
+        <w:rPr>
+          <w:sz w:val="24"/>
+          <w:szCs w:val="24"/>
+        </w:rPr>
+        <w:t>dim_customer</w:t>
+      </w:r>
+      <w:proofErr w:type="spellEnd"/>
+      <w:r>
+        <w:rPr>
+          <w:sz w:val="24"/>
+          <w:szCs w:val="24"/>
+        </w:rPr>
+        <w:t xml:space="preserve">, </w:t>
+      </w:r>
+      <w:proofErr w:type="spellStart"/>
+      <w:r>
+        <w:rPr>
+          <w:sz w:val="24"/>
+          <w:szCs w:val="24"/>
+        </w:rPr>
+        <w:t>dim_date</w:t>
+      </w:r>
+      <w:proofErr w:type="spellEnd"/>
+      <w:r>
+        <w:rPr>
+          <w:sz w:val="24"/>
+          <w:szCs w:val="24"/>
+        </w:rPr>
+        <w:t xml:space="preserve"> </w:t>
+      </w:r>
+      <w:proofErr w:type="spellStart"/>
+      <w:r>
+        <w:rPr>
+          <w:sz w:val="24"/>
+          <w:szCs w:val="24"/>
+        </w:rPr>
+        <w:t>etc</w:t>
+      </w:r>
+      <w:proofErr w:type="spellEnd"/>
+      <w:r>
+        <w:rPr>
+          <w:sz w:val="24"/>
+          <w:szCs w:val="24"/>
+        </w:rPr>
+        <w:t xml:space="preserve"> </w:t>
+      </w:r>
+      <w:proofErr w:type="spellStart"/>
+      <w:r>
+        <w:rPr>
+          <w:sz w:val="24"/>
+          <w:szCs w:val="24"/>
+        </w:rPr>
+        <w:t>etc</w:t>
+      </w:r>
+      <w:proofErr w:type="spellEnd"/>
+      <w:r>
+        <w:rPr>
+          <w:sz w:val="24"/>
+          <w:szCs w:val="24"/>
+        </w:rPr>
+        <w:t xml:space="preserve"> and applied steps m navigation m ja </w:t>
+      </w:r>
+      <w:proofErr w:type="spellStart"/>
+      <w:r>
+        <w:rPr>
+          <w:sz w:val="24"/>
+          <w:szCs w:val="24"/>
+        </w:rPr>
+        <w:t>kr</w:t>
+      </w:r>
+      <w:proofErr w:type="spellEnd"/>
+      <w:r>
+        <w:rPr>
+          <w:sz w:val="24"/>
+          <w:szCs w:val="24"/>
+        </w:rPr>
+        <w:t xml:space="preserve"> upper </w:t>
+      </w:r>
+      <w:proofErr w:type="spellStart"/>
+      <w:r>
+        <w:rPr>
+          <w:sz w:val="24"/>
+          <w:szCs w:val="24"/>
+        </w:rPr>
+        <w:t>jahn</w:t>
+      </w:r>
+      <w:proofErr w:type="spellEnd"/>
+      <w:r>
+        <w:rPr>
+          <w:sz w:val="24"/>
+          <w:szCs w:val="24"/>
+        </w:rPr>
+        <w:t xml:space="preserve"> folder path p[</w:t>
+      </w:r>
+      <w:proofErr w:type="spellStart"/>
+      <w:r>
+        <w:rPr>
+          <w:sz w:val="24"/>
+          <w:szCs w:val="24"/>
+        </w:rPr>
+        <w:t>ura</w:t>
+      </w:r>
+      <w:proofErr w:type="spellEnd"/>
+      <w:r>
+        <w:rPr>
+          <w:sz w:val="24"/>
+          <w:szCs w:val="24"/>
+        </w:rPr>
+        <w:t xml:space="preserve"> mention h commas k </w:t>
+      </w:r>
+      <w:proofErr w:type="spellStart"/>
+      <w:r>
+        <w:rPr>
+          <w:sz w:val="24"/>
+          <w:szCs w:val="24"/>
+        </w:rPr>
+        <w:t>andr</w:t>
+      </w:r>
+      <w:proofErr w:type="spellEnd"/>
+      <w:r>
+        <w:rPr>
+          <w:sz w:val="24"/>
+          <w:szCs w:val="24"/>
+        </w:rPr>
+        <w:t xml:space="preserve">, us ko </w:t>
+      </w:r>
+      <w:proofErr w:type="spellStart"/>
+      <w:r>
+        <w:rPr>
+          <w:sz w:val="24"/>
+          <w:szCs w:val="24"/>
+        </w:rPr>
+        <w:t>hta</w:t>
+      </w:r>
+      <w:proofErr w:type="spellEnd"/>
+      <w:r>
+        <w:rPr>
+          <w:sz w:val="24"/>
+          <w:szCs w:val="24"/>
+        </w:rPr>
+        <w:t xml:space="preserve"> </w:t>
+      </w:r>
+      <w:proofErr w:type="spellStart"/>
+      <w:r>
+        <w:rPr>
+          <w:sz w:val="24"/>
+          <w:szCs w:val="24"/>
+        </w:rPr>
+        <w:t>kr</w:t>
+      </w:r>
+      <w:proofErr w:type="spellEnd"/>
+      <w:r>
+        <w:rPr>
+          <w:sz w:val="24"/>
+          <w:szCs w:val="24"/>
+        </w:rPr>
+        <w:t xml:space="preserve"> just folder path </w:t>
+      </w:r>
+      <w:proofErr w:type="spellStart"/>
+      <w:r>
+        <w:rPr>
+          <w:sz w:val="24"/>
+          <w:szCs w:val="24"/>
+        </w:rPr>
+        <w:t>likh</w:t>
+      </w:r>
+      <w:proofErr w:type="spellEnd"/>
+      <w:r>
+        <w:rPr>
+          <w:sz w:val="24"/>
+          <w:szCs w:val="24"/>
+        </w:rPr>
+        <w:t xml:space="preserve"> den </w:t>
+      </w:r>
+      <w:proofErr w:type="spellStart"/>
+      <w:r>
+        <w:rPr>
+          <w:sz w:val="24"/>
+          <w:szCs w:val="24"/>
+        </w:rPr>
+        <w:t>gy</w:t>
+      </w:r>
+      <w:proofErr w:type="spellEnd"/>
+      <w:r>
+        <w:rPr>
+          <w:sz w:val="24"/>
+          <w:szCs w:val="24"/>
+        </w:rPr>
+        <w:t xml:space="preserve">, or </w:t>
+      </w:r>
+      <w:proofErr w:type="spellStart"/>
+      <w:r>
+        <w:rPr>
+          <w:sz w:val="24"/>
+          <w:szCs w:val="24"/>
+        </w:rPr>
+        <w:t>esa</w:t>
+      </w:r>
+      <w:proofErr w:type="spellEnd"/>
+      <w:r>
+        <w:rPr>
+          <w:sz w:val="24"/>
+          <w:szCs w:val="24"/>
+        </w:rPr>
+        <w:t xml:space="preserve"> hm </w:t>
+      </w:r>
+      <w:proofErr w:type="spellStart"/>
+      <w:r>
+        <w:rPr>
+          <w:sz w:val="24"/>
+          <w:szCs w:val="24"/>
+        </w:rPr>
+        <w:t>hr</w:t>
+      </w:r>
+      <w:proofErr w:type="spellEnd"/>
+      <w:r>
+        <w:rPr>
+          <w:sz w:val="24"/>
+          <w:szCs w:val="24"/>
+        </w:rPr>
+        <w:t xml:space="preserve"> </w:t>
+      </w:r>
+      <w:proofErr w:type="spellStart"/>
+      <w:r>
+        <w:rPr>
+          <w:sz w:val="24"/>
+          <w:szCs w:val="24"/>
+        </w:rPr>
+        <w:t>hr</w:t>
+      </w:r>
+      <w:proofErr w:type="spellEnd"/>
+      <w:r>
+        <w:rPr>
+          <w:sz w:val="24"/>
+          <w:szCs w:val="24"/>
+        </w:rPr>
+        <w:t xml:space="preserve"> data file k </w:t>
+      </w:r>
+      <w:proofErr w:type="spellStart"/>
+      <w:r>
+        <w:rPr>
+          <w:sz w:val="24"/>
+          <w:szCs w:val="24"/>
+        </w:rPr>
+        <w:t>saath</w:t>
+      </w:r>
+      <w:proofErr w:type="spellEnd"/>
+      <w:r>
+        <w:rPr>
+          <w:sz w:val="24"/>
+          <w:szCs w:val="24"/>
+        </w:rPr>
+        <w:t xml:space="preserve"> </w:t>
+      </w:r>
+      <w:proofErr w:type="spellStart"/>
+      <w:r>
+        <w:rPr>
+          <w:sz w:val="24"/>
+          <w:szCs w:val="24"/>
+        </w:rPr>
+        <w:t>kryn</w:t>
+      </w:r>
+      <w:proofErr w:type="spellEnd"/>
+      <w:r>
+        <w:rPr>
+          <w:sz w:val="24"/>
+          <w:szCs w:val="24"/>
+        </w:rPr>
+        <w:t xml:space="preserve"> </w:t>
+      </w:r>
+      <w:proofErr w:type="spellStart"/>
+      <w:r>
+        <w:rPr>
+          <w:sz w:val="24"/>
+          <w:szCs w:val="24"/>
+        </w:rPr>
+        <w:t>gy</w:t>
+      </w:r>
+      <w:proofErr w:type="spellEnd"/>
+      <w:r>
+        <w:rPr>
+          <w:sz w:val="24"/>
+          <w:szCs w:val="24"/>
+        </w:rPr>
+        <w:t xml:space="preserve">, </w:t>
       </w:r>
     </w:p>
     <w:p>
@@ -700,7 +1477,23 @@
           <w:sz w:val="24"/>
           <w:szCs w:val="24"/>
         </w:rPr>
-        <w:t xml:space="preserve">Now if we change the locationof dataset in our computer and refresh the power query editor, we will get error like that: </w:t>
+        <w:t xml:space="preserve">Now if we change the </w:t>
+      </w:r>
+      <w:proofErr w:type="spellStart"/>
+      <w:r>
+        <w:rPr>
+          <w:sz w:val="24"/>
+          <w:szCs w:val="24"/>
+        </w:rPr>
+        <w:t>locationof</w:t>
+      </w:r>
+      <w:proofErr w:type="spellEnd"/>
+      <w:r>
+        <w:rPr>
+          <w:sz w:val="24"/>
+          <w:szCs w:val="24"/>
+        </w:rPr>
+        <w:t xml:space="preserve"> dataset in our computer and refresh the power query editor, we will get error like that: </w:t>
       </w:r>
     </w:p>
     <w:p>
@@ -768,7 +1561,199 @@
           <w:sz w:val="24"/>
           <w:szCs w:val="24"/>
         </w:rPr>
-        <w:t xml:space="preserve">Because file location is changed , esa error hi receiver/client ko bhi ay ga, is liye hm just changed location ka path folder path m (jo k last m mention h jo hm new parameter k zrye bnai thi) den gy and refresh krny s saary ki saary errors khatam ho jayn gy,,, if we have not used new parameter function, we have to change the </w:t>
+        <w:t xml:space="preserve">Because file location is changed , </w:t>
+      </w:r>
+      <w:proofErr w:type="spellStart"/>
+      <w:r>
+        <w:rPr>
+          <w:sz w:val="24"/>
+          <w:szCs w:val="24"/>
+        </w:rPr>
+        <w:t>esa</w:t>
+      </w:r>
+      <w:proofErr w:type="spellEnd"/>
+      <w:r>
+        <w:rPr>
+          <w:sz w:val="24"/>
+          <w:szCs w:val="24"/>
+        </w:rPr>
+        <w:t xml:space="preserve"> error hi receiver/client ko </w:t>
+      </w:r>
+      <w:proofErr w:type="spellStart"/>
+      <w:r>
+        <w:rPr>
+          <w:sz w:val="24"/>
+          <w:szCs w:val="24"/>
+        </w:rPr>
+        <w:t>bhi</w:t>
+      </w:r>
+      <w:proofErr w:type="spellEnd"/>
+      <w:r>
+        <w:rPr>
+          <w:sz w:val="24"/>
+          <w:szCs w:val="24"/>
+        </w:rPr>
+        <w:t xml:space="preserve"> ay ga, is </w:t>
+      </w:r>
+      <w:proofErr w:type="spellStart"/>
+      <w:r>
+        <w:rPr>
+          <w:sz w:val="24"/>
+          <w:szCs w:val="24"/>
+        </w:rPr>
+        <w:t>liye</w:t>
+      </w:r>
+      <w:proofErr w:type="spellEnd"/>
+      <w:r>
+        <w:rPr>
+          <w:sz w:val="24"/>
+          <w:szCs w:val="24"/>
+        </w:rPr>
+        <w:t xml:space="preserve"> hm just changed location ka path folder path m (jo k last m mention h jo hm new parameter k </w:t>
+      </w:r>
+      <w:proofErr w:type="spellStart"/>
+      <w:r>
+        <w:rPr>
+          <w:sz w:val="24"/>
+          <w:szCs w:val="24"/>
+        </w:rPr>
+        <w:t>zrye</w:t>
+      </w:r>
+      <w:proofErr w:type="spellEnd"/>
+      <w:r>
+        <w:rPr>
+          <w:sz w:val="24"/>
+          <w:szCs w:val="24"/>
+        </w:rPr>
+        <w:t xml:space="preserve"> </w:t>
+      </w:r>
+      <w:proofErr w:type="spellStart"/>
+      <w:r>
+        <w:rPr>
+          <w:sz w:val="24"/>
+          <w:szCs w:val="24"/>
+        </w:rPr>
+        <w:t>bnai</w:t>
+      </w:r>
+      <w:proofErr w:type="spellEnd"/>
+      <w:r>
+        <w:rPr>
+          <w:sz w:val="24"/>
+          <w:szCs w:val="24"/>
+        </w:rPr>
+        <w:t xml:space="preserve"> </w:t>
+      </w:r>
+      <w:proofErr w:type="spellStart"/>
+      <w:r>
+        <w:rPr>
+          <w:sz w:val="24"/>
+          <w:szCs w:val="24"/>
+        </w:rPr>
+        <w:t>thi</w:t>
+      </w:r>
+      <w:proofErr w:type="spellEnd"/>
+      <w:r>
+        <w:rPr>
+          <w:sz w:val="24"/>
+          <w:szCs w:val="24"/>
+        </w:rPr>
+        <w:t xml:space="preserve">) den </w:t>
+      </w:r>
+      <w:proofErr w:type="spellStart"/>
+      <w:r>
+        <w:rPr>
+          <w:sz w:val="24"/>
+          <w:szCs w:val="24"/>
+        </w:rPr>
+        <w:t>gy</w:t>
+      </w:r>
+      <w:proofErr w:type="spellEnd"/>
+      <w:r>
+        <w:rPr>
+          <w:sz w:val="24"/>
+          <w:szCs w:val="24"/>
+        </w:rPr>
+        <w:t xml:space="preserve"> and refresh </w:t>
+      </w:r>
+      <w:proofErr w:type="spellStart"/>
+      <w:r>
+        <w:rPr>
+          <w:sz w:val="24"/>
+          <w:szCs w:val="24"/>
+        </w:rPr>
+        <w:t>krny</w:t>
+      </w:r>
+      <w:proofErr w:type="spellEnd"/>
+      <w:r>
+        <w:rPr>
+          <w:sz w:val="24"/>
+          <w:szCs w:val="24"/>
+        </w:rPr>
+        <w:t xml:space="preserve"> s </w:t>
+      </w:r>
+      <w:proofErr w:type="spellStart"/>
+      <w:r>
+        <w:rPr>
+          <w:sz w:val="24"/>
+          <w:szCs w:val="24"/>
+        </w:rPr>
+        <w:t>saary</w:t>
+      </w:r>
+      <w:proofErr w:type="spellEnd"/>
+      <w:r>
+        <w:rPr>
+          <w:sz w:val="24"/>
+          <w:szCs w:val="24"/>
+        </w:rPr>
+        <w:t xml:space="preserve"> ki </w:t>
+      </w:r>
+      <w:proofErr w:type="spellStart"/>
+      <w:r>
+        <w:rPr>
+          <w:sz w:val="24"/>
+          <w:szCs w:val="24"/>
+        </w:rPr>
+        <w:t>saary</w:t>
+      </w:r>
+      <w:proofErr w:type="spellEnd"/>
+      <w:r>
+        <w:rPr>
+          <w:sz w:val="24"/>
+          <w:szCs w:val="24"/>
+        </w:rPr>
+        <w:t xml:space="preserve"> errors khatam ho </w:t>
+      </w:r>
+      <w:proofErr w:type="spellStart"/>
+      <w:r>
+        <w:rPr>
+          <w:sz w:val="24"/>
+          <w:szCs w:val="24"/>
+        </w:rPr>
+        <w:t>jayn</w:t>
+      </w:r>
+      <w:proofErr w:type="spellEnd"/>
+      <w:r>
+        <w:rPr>
+          <w:sz w:val="24"/>
+          <w:szCs w:val="24"/>
+        </w:rPr>
+        <w:t xml:space="preserve"> </w:t>
+      </w:r>
+      <w:proofErr w:type="spellStart"/>
+      <w:r>
+        <w:rPr>
+          <w:sz w:val="24"/>
+          <w:szCs w:val="24"/>
+        </w:rPr>
+        <w:t>gy</w:t>
+      </w:r>
+      <w:proofErr w:type="spellEnd"/>
+      <w:r>
+        <w:rPr>
+          <w:sz w:val="24"/>
+          <w:szCs w:val="24"/>
+        </w:rPr>
+        <w:t xml:space="preserve">,,, if we have not used new parameter function, we have to change the </w:t>
       </w:r>
       <w:r>
         <w:rPr>
@@ -817,7 +1802,39 @@
           <w:szCs w:val="24"/>
         </w:rPr>
         <w:lastRenderedPageBreak/>
-        <w:t xml:space="preserve">The total cost in the procurement table is slightly different from the total cost in the total sales table. The procurement table is showing us the total cost for purchasing that product, and in the sales column, it shows us the cost of goods sold. For example, if a company buys shirts from a supplier and then sells shirts to different customers, now he bought 500 shirts, and every shirt was priced at Rs. 500, so he got Rs. 250000, and this Rs. 250000 will be the total cost in the procurement table, . Now, he sold products to different customers. For example, he sold each product at the cost of Rs. 700, and he sold 500 products. Then the total revenue generated would be equal to 700 * 500 = 350000, now, from this 350,000 amount, the cost of making this product would be equal to 250,000. In this case, 250000 will be the total cost in the sales table. And this cost is actually the cost of goods sold. it is also true if we have the same number of purchasing and the same number of buying, then the cost of goods sold in the sales table (i.e., the total cost in the sales table) will be equal to the total cost in the procurement table, But this is not always 100% right due to some taxes, purchase discounts etc etc   </w:t>
+        <w:t xml:space="preserve">The total cost in the procurement table is slightly different from the total cost in the total sales table. The procurement table is showing us the total cost for purchasing that product, and in the sales column, it shows us the cost of goods sold. For example, if a company buys shirts from a supplier and then sells shirts to different customers, now he bought 500 shirts, and every shirt was priced at Rs. 500, so he got Rs. 250000, and this Rs. 250000 will be the total cost in the procurement table, . Now, he sold products to different customers. For example, he sold each product at the cost of Rs. 700, and he sold 500 products. Then the total revenue generated would be equal to 700 * 500 = 350000, now, from this 350,000 amount, the cost of making this product would be equal to 250,000. In this case, 250000 will be the total cost in the sales table. And this cost is actually the cost of goods sold. it is also true if we have the same number of purchasing and the same number of buying, then the cost of goods sold in the sales table (i.e., the total cost in the sales table) will be equal to the total cost in the procurement table, But this is not always 100% right due to some taxes, purchase discounts </w:t>
+      </w:r>
+      <w:proofErr w:type="spellStart"/>
+      <w:r>
+        <w:rPr>
+          <w:sz w:val="24"/>
+          <w:szCs w:val="24"/>
+        </w:rPr>
+        <w:t>etc</w:t>
+      </w:r>
+      <w:proofErr w:type="spellEnd"/>
+      <w:r>
+        <w:rPr>
+          <w:sz w:val="24"/>
+          <w:szCs w:val="24"/>
+        </w:rPr>
+        <w:t xml:space="preserve"> </w:t>
+      </w:r>
+      <w:proofErr w:type="spellStart"/>
+      <w:r>
+        <w:rPr>
+          <w:sz w:val="24"/>
+          <w:szCs w:val="24"/>
+        </w:rPr>
+        <w:t>etc</w:t>
+      </w:r>
+      <w:proofErr w:type="spellEnd"/>
+      <w:r>
+        <w:rPr>
+          <w:sz w:val="24"/>
+          <w:szCs w:val="24"/>
+        </w:rPr>
+        <w:t xml:space="preserve">   </w:t>
       </w:r>
     </w:p>
     <w:p>
@@ -1031,12 +2048,85 @@
           <w:szCs w:val="24"/>
         </w:rPr>
       </w:pPr>
-      <w:r>
-        <w:rPr>
-          <w:sz w:val="24"/>
-          <w:szCs w:val="24"/>
-        </w:rPr>
-        <w:t>Average_lead_time (order place hony s le kr product k receive hiny tk ka time)</w:t>
+      <w:proofErr w:type="spellStart"/>
+      <w:r>
+        <w:rPr>
+          <w:sz w:val="24"/>
+          <w:szCs w:val="24"/>
+        </w:rPr>
+        <w:t>Average_lead_time</w:t>
+      </w:r>
+      <w:proofErr w:type="spellEnd"/>
+      <w:r>
+        <w:rPr>
+          <w:sz w:val="24"/>
+          <w:szCs w:val="24"/>
+        </w:rPr>
+        <w:t xml:space="preserve"> (order place </w:t>
+      </w:r>
+      <w:proofErr w:type="spellStart"/>
+      <w:r>
+        <w:rPr>
+          <w:sz w:val="24"/>
+          <w:szCs w:val="24"/>
+        </w:rPr>
+        <w:t>hony</w:t>
+      </w:r>
+      <w:proofErr w:type="spellEnd"/>
+      <w:r>
+        <w:rPr>
+          <w:sz w:val="24"/>
+          <w:szCs w:val="24"/>
+        </w:rPr>
+        <w:t xml:space="preserve"> s le </w:t>
+      </w:r>
+      <w:proofErr w:type="spellStart"/>
+      <w:r>
+        <w:rPr>
+          <w:sz w:val="24"/>
+          <w:szCs w:val="24"/>
+        </w:rPr>
+        <w:t>kr</w:t>
+      </w:r>
+      <w:proofErr w:type="spellEnd"/>
+      <w:r>
+        <w:rPr>
+          <w:sz w:val="24"/>
+          <w:szCs w:val="24"/>
+        </w:rPr>
+        <w:t xml:space="preserve"> product k receive </w:t>
+      </w:r>
+      <w:proofErr w:type="spellStart"/>
+      <w:r>
+        <w:rPr>
+          <w:sz w:val="24"/>
+          <w:szCs w:val="24"/>
+        </w:rPr>
+        <w:t>hiny</w:t>
+      </w:r>
+      <w:proofErr w:type="spellEnd"/>
+      <w:r>
+        <w:rPr>
+          <w:sz w:val="24"/>
+          <w:szCs w:val="24"/>
+        </w:rPr>
+        <w:t xml:space="preserve"> </w:t>
+      </w:r>
+      <w:proofErr w:type="spellStart"/>
+      <w:r>
+        <w:rPr>
+          <w:sz w:val="24"/>
+          <w:szCs w:val="24"/>
+        </w:rPr>
+        <w:t>tk</w:t>
+      </w:r>
+      <w:proofErr w:type="spellEnd"/>
+      <w:r>
+        <w:rPr>
+          <w:sz w:val="24"/>
+          <w:szCs w:val="24"/>
+        </w:rPr>
+        <w:t xml:space="preserve"> ka time)</w:t>
       </w:r>
     </w:p>
     <w:p>
@@ -1051,12 +2141,21 @@
           <w:szCs w:val="24"/>
         </w:rPr>
       </w:pPr>
-      <w:r>
-        <w:rPr>
-          <w:sz w:val="24"/>
-          <w:szCs w:val="24"/>
-        </w:rPr>
-        <w:t>Total_shipment (sum of all orders)</w:t>
+      <w:proofErr w:type="spellStart"/>
+      <w:r>
+        <w:rPr>
+          <w:sz w:val="24"/>
+          <w:szCs w:val="24"/>
+        </w:rPr>
+        <w:t>Total_shipment</w:t>
+      </w:r>
+      <w:proofErr w:type="spellEnd"/>
+      <w:r>
+        <w:rPr>
+          <w:sz w:val="24"/>
+          <w:szCs w:val="24"/>
+        </w:rPr>
+        <w:t xml:space="preserve"> (sum of all orders)</w:t>
       </w:r>
     </w:p>
     <w:p>
@@ -1076,7 +2175,135 @@
           <w:sz w:val="24"/>
           <w:szCs w:val="24"/>
         </w:rPr>
-        <w:t>Perfect order percentage (yani vo products jo k defected bhu nhi th and vo successfully delieved ho gay customer tk)</w:t>
+        <w:t>Perfect order percentage (</w:t>
+      </w:r>
+      <w:proofErr w:type="spellStart"/>
+      <w:r>
+        <w:rPr>
+          <w:sz w:val="24"/>
+          <w:szCs w:val="24"/>
+        </w:rPr>
+        <w:t>yani</w:t>
+      </w:r>
+      <w:proofErr w:type="spellEnd"/>
+      <w:r>
+        <w:rPr>
+          <w:sz w:val="24"/>
+          <w:szCs w:val="24"/>
+        </w:rPr>
+        <w:t xml:space="preserve"> </w:t>
+      </w:r>
+      <w:proofErr w:type="spellStart"/>
+      <w:r>
+        <w:rPr>
+          <w:sz w:val="24"/>
+          <w:szCs w:val="24"/>
+        </w:rPr>
+        <w:t>vo</w:t>
+      </w:r>
+      <w:proofErr w:type="spellEnd"/>
+      <w:r>
+        <w:rPr>
+          <w:sz w:val="24"/>
+          <w:szCs w:val="24"/>
+        </w:rPr>
+        <w:t xml:space="preserve"> products jo k defected </w:t>
+      </w:r>
+      <w:proofErr w:type="spellStart"/>
+      <w:r>
+        <w:rPr>
+          <w:sz w:val="24"/>
+          <w:szCs w:val="24"/>
+        </w:rPr>
+        <w:t>bhu</w:t>
+      </w:r>
+      <w:proofErr w:type="spellEnd"/>
+      <w:r>
+        <w:rPr>
+          <w:sz w:val="24"/>
+          <w:szCs w:val="24"/>
+        </w:rPr>
+        <w:t xml:space="preserve"> </w:t>
+      </w:r>
+      <w:proofErr w:type="spellStart"/>
+      <w:r>
+        <w:rPr>
+          <w:sz w:val="24"/>
+          <w:szCs w:val="24"/>
+        </w:rPr>
+        <w:t>nhi</w:t>
+      </w:r>
+      <w:proofErr w:type="spellEnd"/>
+      <w:r>
+        <w:rPr>
+          <w:sz w:val="24"/>
+          <w:szCs w:val="24"/>
+        </w:rPr>
+        <w:t xml:space="preserve"> </w:t>
+      </w:r>
+      <w:proofErr w:type="spellStart"/>
+      <w:r>
+        <w:rPr>
+          <w:sz w:val="24"/>
+          <w:szCs w:val="24"/>
+        </w:rPr>
+        <w:t>th</w:t>
+      </w:r>
+      <w:proofErr w:type="spellEnd"/>
+      <w:r>
+        <w:rPr>
+          <w:sz w:val="24"/>
+          <w:szCs w:val="24"/>
+        </w:rPr>
+        <w:t xml:space="preserve"> and </w:t>
+      </w:r>
+      <w:proofErr w:type="spellStart"/>
+      <w:r>
+        <w:rPr>
+          <w:sz w:val="24"/>
+          <w:szCs w:val="24"/>
+        </w:rPr>
+        <w:t>vo</w:t>
+      </w:r>
+      <w:proofErr w:type="spellEnd"/>
+      <w:r>
+        <w:rPr>
+          <w:sz w:val="24"/>
+          <w:szCs w:val="24"/>
+        </w:rPr>
+        <w:t xml:space="preserve"> successfully </w:t>
+      </w:r>
+      <w:proofErr w:type="spellStart"/>
+      <w:r>
+        <w:rPr>
+          <w:sz w:val="24"/>
+          <w:szCs w:val="24"/>
+        </w:rPr>
+        <w:t>delieved</w:t>
+      </w:r>
+      <w:proofErr w:type="spellEnd"/>
+      <w:r>
+        <w:rPr>
+          <w:sz w:val="24"/>
+          <w:szCs w:val="24"/>
+        </w:rPr>
+        <w:t xml:space="preserve"> ho gay customer </w:t>
+      </w:r>
+      <w:proofErr w:type="spellStart"/>
+      <w:r>
+        <w:rPr>
+          <w:sz w:val="24"/>
+          <w:szCs w:val="24"/>
+        </w:rPr>
+        <w:t>tk</w:t>
+      </w:r>
+      <w:proofErr w:type="spellEnd"/>
+      <w:r>
+        <w:rPr>
+          <w:sz w:val="24"/>
+          <w:szCs w:val="24"/>
+        </w:rPr>
+        <w:t>)</w:t>
       </w:r>
     </w:p>
     <w:p>
@@ -1091,40 +2318,32 @@
           <w:szCs w:val="24"/>
         </w:rPr>
       </w:pPr>
-      <w:r>
-        <w:rPr>
-          <w:sz w:val="24"/>
-          <w:szCs w:val="24"/>
-        </w:rPr>
-        <w:t>Total sales cost  (</w:t>
-      </w:r>
-      <w:r>
-        <w:rPr>
-          <w:sz w:val="24"/>
-          <w:szCs w:val="24"/>
-        </w:rPr>
-        <w:t xml:space="preserve">we should sum the total cost from the sales table instead of the procurement table. </w:t>
-      </w:r>
-      <w:r>
-        <w:rPr>
-          <w:sz w:val="24"/>
-          <w:szCs w:val="24"/>
-        </w:rPr>
-        <w:t xml:space="preserve">The lecturer is using total cost sum from the procurement table, which is not correct because the procurement table's cost or sales table's total </w:t>
-      </w:r>
-      <w:r>
-        <w:rPr>
-          <w:sz w:val="24"/>
-          <w:szCs w:val="24"/>
-        </w:rPr>
-        <w:t xml:space="preserve">in </w:t>
-      </w:r>
-      <w:r>
-        <w:rPr>
-          <w:sz w:val="24"/>
-          <w:szCs w:val="24"/>
-        </w:rPr>
-        <w:t>mostly cases, it is different due to taxes and discounts, etc., so to calculate total sales cost, we should use the sum of the total cost column from the sales table instead of the procurement table</w:t>
+    </w:p>
+    <w:p>
+      <w:pPr>
+        <w:pStyle w:val="ListParagraph"/>
+        <w:numPr>
+          <w:ilvl w:val="0"/>
+          <w:numId w:val="3"/>
+        </w:numPr>
+        <w:rPr>
+          <w:sz w:val="24"/>
+          <w:szCs w:val="24"/>
+        </w:rPr>
+      </w:pPr>
+      <w:r>
+        <w:rPr>
+          <w:sz w:val="24"/>
+          <w:szCs w:val="24"/>
+        </w:rPr>
+        <w:t xml:space="preserve">Total sales cost  (we should sum the total cost from the sales table instead of the procurement table. </w:t>
+      </w:r>
+      <w:r>
+        <w:rPr>
+          <w:sz w:val="24"/>
+          <w:szCs w:val="24"/>
+        </w:rPr>
+        <w:t>The lecturer is using total cost sum from the procurement table, which is not correct because the procurement table's cost or sales table's total in mostly cases, it is different due to taxes and discounts, etc., so to calculate total sales cost, we should use the sum of the total cost column from the sales table instead of the procurement table</w:t>
       </w:r>
       <w:r>
         <w:rPr>
@@ -1132,6 +2351,130 @@
           <w:szCs w:val="24"/>
         </w:rPr>
         <w:t>)</w:t>
+      </w:r>
+    </w:p>
+    <w:p>
+      <w:pPr>
+        <w:rPr>
+          <w:sz w:val="24"/>
+          <w:szCs w:val="24"/>
+        </w:rPr>
+      </w:pPr>
+    </w:p>
+    <w:p>
+      <w:pPr>
+        <w:rPr>
+          <w:sz w:val="24"/>
+          <w:szCs w:val="24"/>
+        </w:rPr>
+      </w:pPr>
+      <w:r>
+        <w:rPr>
+          <w:sz w:val="24"/>
+          <w:szCs w:val="24"/>
+        </w:rPr>
+        <w:lastRenderedPageBreak/>
+        <w:t xml:space="preserve">There are a lot of different themes in Power BI. Just go to Power BI Studio, log in there, then go to colors, and there, whichever theme or color you are liking, select that theme or color. Click on export and then export it </w:t>
+      </w:r>
+      <w:r>
+        <w:rPr>
+          <w:sz w:val="24"/>
+          <w:szCs w:val="24"/>
+        </w:rPr>
+        <w:t>in .</w:t>
+      </w:r>
+      <w:proofErr w:type="spellStart"/>
+      <w:r>
+        <w:rPr>
+          <w:sz w:val="24"/>
+          <w:szCs w:val="24"/>
+        </w:rPr>
+        <w:t>json</w:t>
+      </w:r>
+      <w:proofErr w:type="spellEnd"/>
+      <w:r>
+        <w:rPr>
+          <w:sz w:val="24"/>
+          <w:szCs w:val="24"/>
+        </w:rPr>
+        <w:t xml:space="preserve"> file,, </w:t>
+      </w:r>
+      <w:r>
+        <w:rPr>
+          <w:sz w:val="24"/>
+          <w:szCs w:val="24"/>
+        </w:rPr>
+        <w:t>come to Power BI and click Browse more themes and import the JSON file</w:t>
+      </w:r>
+      <w:r>
+        <w:rPr>
+          <w:sz w:val="24"/>
+          <w:szCs w:val="24"/>
+        </w:rPr>
+        <w:t xml:space="preserve">, </w:t>
+      </w:r>
+      <w:r>
+        <w:rPr>
+          <w:sz w:val="24"/>
+          <w:szCs w:val="24"/>
+        </w:rPr>
+        <w:t xml:space="preserve">then automatically that theme will be </w:t>
+      </w:r>
+      <w:r>
+        <w:rPr>
+          <w:sz w:val="24"/>
+          <w:szCs w:val="24"/>
+        </w:rPr>
+        <w:t>applied</w:t>
+      </w:r>
+      <w:r>
+        <w:rPr>
+          <w:sz w:val="24"/>
+          <w:szCs w:val="24"/>
+        </w:rPr>
+        <w:t>.</w:t>
+      </w:r>
+      <w:r>
+        <w:rPr>
+          <w:sz w:val="24"/>
+          <w:szCs w:val="24"/>
+        </w:rPr>
+        <w:t xml:space="preserve"> </w:t>
+      </w:r>
+      <w:r>
+        <w:rPr>
+          <w:sz w:val="24"/>
+          <w:szCs w:val="24"/>
+        </w:rPr>
+        <w:t>But before you can apply a theme, you have to select all the backgrounds and set</w:t>
+      </w:r>
+      <w:r>
+        <w:rPr>
+          <w:sz w:val="24"/>
+          <w:szCs w:val="24"/>
+        </w:rPr>
+        <w:t xml:space="preserve"> to default by going to</w:t>
+      </w:r>
+      <w:r>
+        <w:rPr>
+          <w:sz w:val="24"/>
+          <w:szCs w:val="24"/>
+        </w:rPr>
+        <w:t xml:space="preserve"> general </w:t>
+      </w:r>
+      <w:r>
+        <w:rPr>
+          <w:sz w:val="24"/>
+          <w:szCs w:val="24"/>
+        </w:rPr>
+        <w:t xml:space="preserve">and us m effect m set to default ka option h </w:t>
+      </w:r>
+      <w:r>
+        <w:rPr>
+          <w:sz w:val="24"/>
+          <w:szCs w:val="24"/>
+        </w:rPr>
+        <w:t>and then apply the theme. For example if you have a background of charts or cards with text boxes, you have to set them to default.</w:t>
       </w:r>
     </w:p>
     <w:p>
@@ -2150,6 +3493,7 @@
   <w:style w:type="character" w:default="1" w:styleId="DefaultParagraphFont">
     <w:name w:val="Default Paragraph Font"/>
     <w:uiPriority w:val="1"/>
+    <w:semiHidden/>
     <w:unhideWhenUsed/>
   </w:style>
   <w:style w:type="table" w:default="1" w:styleId="TableNormal">

</xml_diff>

<commit_message>
created detailed analysis for supplier and start analysing inventory
</commit_message>
<xml_diff>
--- a/learning_material_of supply chain analysis.docx
+++ b/learning_material_of supply chain analysis.docx
@@ -2363,6 +2363,9 @@
     </w:p>
     <w:p>
       <w:pPr>
+        <w:pBdr>
+          <w:bottom w:val="single" w:sz="6" w:space="1" w:color="auto"/>
+        </w:pBdr>
         <w:rPr>
           <w:sz w:val="24"/>
           <w:szCs w:val="24"/>
@@ -2476,14 +2479,605 @@
         </w:rPr>
         <w:t>and then apply the theme. For example if you have a background of charts or cards with text boxes, you have to set them to default.</w:t>
       </w:r>
-    </w:p>
-    <w:p>
-      <w:pPr>
-        <w:rPr>
-          <w:sz w:val="24"/>
-          <w:szCs w:val="24"/>
-        </w:rPr>
-      </w:pPr>
+      <w:r>
+        <w:rPr>
+          <w:sz w:val="24"/>
+          <w:szCs w:val="24"/>
+        </w:rPr>
+        <w:t xml:space="preserve"> </w:t>
+      </w:r>
+      <w:r>
+        <w:rPr>
+          <w:sz w:val="24"/>
+          <w:szCs w:val="24"/>
+        </w:rPr>
+        <w:t>If colors are not changed after theme export even after</w:t>
+      </w:r>
+      <w:r>
+        <w:rPr>
+          <w:sz w:val="24"/>
+          <w:szCs w:val="24"/>
+        </w:rPr>
+        <w:t xml:space="preserve"> resetting to default</w:t>
+      </w:r>
+      <w:r>
+        <w:rPr>
+          <w:sz w:val="24"/>
+          <w:szCs w:val="24"/>
+        </w:rPr>
+        <w:t xml:space="preserve">, </w:t>
+      </w:r>
+      <w:r>
+        <w:rPr>
+          <w:sz w:val="24"/>
+          <w:szCs w:val="24"/>
+        </w:rPr>
+        <w:t>then manually apply the colors of the theme behind the background of charts and visuals as well</w:t>
+      </w:r>
+      <w:r>
+        <w:rPr>
+          <w:sz w:val="24"/>
+          <w:szCs w:val="24"/>
+        </w:rPr>
+        <w:t>, of course a lot of work!</w:t>
+      </w:r>
+    </w:p>
+    <w:p>
+      <w:pPr>
+        <w:rPr>
+          <w:b/>
+          <w:bCs/>
+          <w:sz w:val="24"/>
+          <w:szCs w:val="24"/>
+        </w:rPr>
+      </w:pPr>
+    </w:p>
+    <w:p>
+      <w:pPr>
+        <w:rPr>
+          <w:b/>
+          <w:bCs/>
+          <w:sz w:val="24"/>
+          <w:szCs w:val="24"/>
+        </w:rPr>
+      </w:pPr>
+      <w:r>
+        <w:rPr>
+          <w:b/>
+          <w:bCs/>
+          <w:sz w:val="24"/>
+          <w:szCs w:val="24"/>
+        </w:rPr>
+        <w:t>U</w:t>
+      </w:r>
+      <w:r>
+        <w:rPr>
+          <w:b/>
+          <w:bCs/>
+          <w:sz w:val="24"/>
+          <w:szCs w:val="24"/>
+        </w:rPr>
+        <w:t xml:space="preserve">se case of using the fields option in the new parameter </w:t>
+      </w:r>
+      <w:r>
+        <w:rPr>
+          <w:b/>
+          <w:bCs/>
+          <w:sz w:val="24"/>
+          <w:szCs w:val="24"/>
+        </w:rPr>
+        <w:t>under modeling tab:</w:t>
+      </w:r>
+    </w:p>
+    <w:p>
+      <w:pPr>
+        <w:rPr>
+          <w:sz w:val="24"/>
+          <w:szCs w:val="24"/>
+          <w:lang w:val="en-PK"/>
+        </w:rPr>
+      </w:pPr>
+      <w:r>
+        <w:rPr>
+          <w:sz w:val="24"/>
+          <w:szCs w:val="24"/>
+          <w:lang w:val="en-PK"/>
+        </w:rPr>
+        <w:t xml:space="preserve">If you have created three visuals, such as: </w:t>
+      </w:r>
+    </w:p>
+    <w:p>
+      <w:pPr>
+        <w:numPr>
+          <w:ilvl w:val="0"/>
+          <w:numId w:val="4"/>
+        </w:numPr>
+        <w:rPr>
+          <w:sz w:val="24"/>
+          <w:szCs w:val="24"/>
+          <w:lang w:val="en-PK"/>
+        </w:rPr>
+      </w:pPr>
+      <w:r>
+        <w:rPr>
+          <w:sz w:val="24"/>
+          <w:szCs w:val="24"/>
+          <w:lang w:val="en-PK"/>
+        </w:rPr>
+        <w:t>order quantity per month</w:t>
+      </w:r>
+    </w:p>
+    <w:p>
+      <w:pPr>
+        <w:numPr>
+          <w:ilvl w:val="0"/>
+          <w:numId w:val="4"/>
+        </w:numPr>
+        <w:rPr>
+          <w:sz w:val="24"/>
+          <w:szCs w:val="24"/>
+          <w:lang w:val="en-PK"/>
+        </w:rPr>
+      </w:pPr>
+      <w:r>
+        <w:rPr>
+          <w:sz w:val="24"/>
+          <w:szCs w:val="24"/>
+          <w:lang w:val="en-PK"/>
+        </w:rPr>
+        <w:t>sales quantity per month</w:t>
+      </w:r>
+    </w:p>
+    <w:p>
+      <w:pPr>
+        <w:numPr>
+          <w:ilvl w:val="0"/>
+          <w:numId w:val="4"/>
+        </w:numPr>
+        <w:rPr>
+          <w:sz w:val="24"/>
+          <w:szCs w:val="24"/>
+          <w:lang w:val="en-PK"/>
+        </w:rPr>
+      </w:pPr>
+      <w:r>
+        <w:rPr>
+          <w:sz w:val="24"/>
+          <w:szCs w:val="24"/>
+          <w:lang w:val="en-PK"/>
+        </w:rPr>
+        <w:t>total revenue per month</w:t>
+      </w:r>
+    </w:p>
+    <w:p>
+      <w:pPr>
+        <w:rPr>
+          <w:sz w:val="24"/>
+          <w:szCs w:val="24"/>
+          <w:lang w:val="en-PK"/>
+        </w:rPr>
+      </w:pPr>
+      <w:r>
+        <w:rPr>
+          <w:sz w:val="24"/>
+          <w:szCs w:val="24"/>
+          <w:lang w:val="en-PK"/>
+        </w:rPr>
+        <w:t xml:space="preserve">instead of creating three visuals, you can create a single visual and create a slicer such that order quantity, sales quantity, or revenue quantity are present on the slicer. When you click any slicer button, the graph changes according to that specific filter. </w:t>
+      </w:r>
+    </w:p>
+    <w:p>
+      <w:pPr>
+        <w:rPr>
+          <w:sz w:val="24"/>
+          <w:szCs w:val="24"/>
+        </w:rPr>
+      </w:pPr>
+      <w:r>
+        <w:rPr>
+          <w:sz w:val="24"/>
+          <w:szCs w:val="24"/>
+        </w:rPr>
+        <w:t>If we create the simple slicer, all the three values are present in different tables. We cannot create a simple slicer using Power BI. We have to use the fields option, which is present under the New Parameter button of the Modeling tab. On clicking the fields option, a new window will appear in which you have to click on those measures that you want to show in the form of a slicer.</w:t>
+      </w:r>
+      <w:r>
+        <w:rPr>
+          <w:sz w:val="24"/>
+          <w:szCs w:val="24"/>
+        </w:rPr>
+        <w:t xml:space="preserve"> </w:t>
+      </w:r>
+      <w:r>
+        <w:rPr>
+          <w:sz w:val="24"/>
+          <w:szCs w:val="24"/>
+        </w:rPr>
+        <w:t>Make sure to use measures because if you use table columns then this slicer that will appear after that</w:t>
+      </w:r>
+      <w:r>
+        <w:rPr>
+          <w:sz w:val="24"/>
+          <w:szCs w:val="24"/>
+        </w:rPr>
+        <w:t>,</w:t>
+      </w:r>
+      <w:r>
+        <w:rPr>
+          <w:sz w:val="24"/>
+          <w:szCs w:val="24"/>
+        </w:rPr>
+        <w:t xml:space="preserve"> will not work properly.</w:t>
+      </w:r>
+      <w:r>
+        <w:rPr>
+          <w:sz w:val="24"/>
+          <w:szCs w:val="24"/>
+        </w:rPr>
+        <w:t xml:space="preserve"> </w:t>
+      </w:r>
+      <w:r>
+        <w:rPr>
+          <w:sz w:val="24"/>
+          <w:szCs w:val="24"/>
+        </w:rPr>
+        <w:t>Make sure to use the proper name</w:t>
+      </w:r>
+      <w:r>
+        <w:rPr>
+          <w:sz w:val="24"/>
+          <w:szCs w:val="24"/>
+        </w:rPr>
+        <w:t xml:space="preserve"> of the Name</w:t>
+      </w:r>
+      <w:r>
+        <w:rPr>
+          <w:sz w:val="24"/>
+          <w:szCs w:val="24"/>
+        </w:rPr>
+        <w:t xml:space="preserve"> because when you click OK inside the fields window, </w:t>
+      </w:r>
+      <w:r>
+        <w:rPr>
+          <w:sz w:val="24"/>
+          <w:szCs w:val="24"/>
+        </w:rPr>
+        <w:t>a new slicer will appear on the screen. This slicer is actually a new table that has been created on the tables section, the right side of the Power BI window.</w:t>
+      </w:r>
+      <w:r>
+        <w:rPr>
+          <w:sz w:val="24"/>
+          <w:szCs w:val="24"/>
+        </w:rPr>
+        <w:t xml:space="preserve"> </w:t>
+      </w:r>
+      <w:r>
+        <w:rPr>
+          <w:sz w:val="24"/>
+          <w:szCs w:val="24"/>
+        </w:rPr>
+        <w:t>Convert this slicer into a slicer button by clicking on the slicer button that is present inside all the visuals option on the right side of the Power BI screen.</w:t>
+      </w:r>
+      <w:r>
+        <w:rPr>
+          <w:sz w:val="24"/>
+          <w:szCs w:val="24"/>
+        </w:rPr>
+        <w:t xml:space="preserve"> </w:t>
+      </w:r>
+    </w:p>
+    <w:p>
+      <w:pPr>
+        <w:pBdr>
+          <w:bottom w:val="single" w:sz="6" w:space="1" w:color="auto"/>
+        </w:pBdr>
+        <w:rPr>
+          <w:sz w:val="24"/>
+          <w:szCs w:val="24"/>
+        </w:rPr>
+      </w:pPr>
+      <w:r>
+        <w:rPr>
+          <w:sz w:val="24"/>
+          <w:szCs w:val="24"/>
+        </w:rPr>
+        <w:t>So going to that specific visual where you want to show it on one</w:t>
+      </w:r>
+      <w:r>
+        <w:rPr>
+          <w:sz w:val="24"/>
+          <w:szCs w:val="24"/>
+        </w:rPr>
+        <w:t xml:space="preserve"> information instead of three</w:t>
+      </w:r>
+      <w:r>
+        <w:rPr>
+          <w:sz w:val="24"/>
+          <w:szCs w:val="24"/>
+        </w:rPr>
+        <w:t>, in the x-axis you have to show the months because all three visuals have a specific common column, month. On the y-axis, where you have to show either revenue or total quantity order or total sales, you have to put that table name or actually that slicer in that y-axis portion. You can easily shift from one slicer to the other or shift from one visual to the other by just clicking the button of the slicers.</w:t>
+      </w:r>
+      <w:r>
+        <w:rPr>
+          <w:sz w:val="24"/>
+          <w:szCs w:val="24"/>
+        </w:rPr>
+        <w:t xml:space="preserve"> </w:t>
+      </w:r>
+      <w:r>
+        <w:rPr>
+          <w:sz w:val="24"/>
+          <w:szCs w:val="24"/>
+        </w:rPr>
+        <w:t xml:space="preserve">When you put that slicer on that specific X axis or Y axis according to your requirements, </w:t>
+      </w:r>
+      <w:r>
+        <w:rPr>
+          <w:sz w:val="24"/>
+          <w:szCs w:val="24"/>
+        </w:rPr>
+        <w:t xml:space="preserve">all the measures that are present on that slicer will be shown but you want to show only one specific visual or one specific line on your graph. You have to select that line. </w:t>
+      </w:r>
+      <w:r>
+        <w:rPr>
+          <w:sz w:val="24"/>
+          <w:szCs w:val="24"/>
+        </w:rPr>
+        <w:lastRenderedPageBreak/>
+        <w:t xml:space="preserve">When you click the </w:t>
+      </w:r>
+      <w:proofErr w:type="spellStart"/>
+      <w:r>
+        <w:rPr>
+          <w:sz w:val="24"/>
+          <w:szCs w:val="24"/>
+        </w:rPr>
+        <w:t>e</w:t>
+      </w:r>
+      <w:r>
+        <w:rPr>
+          <w:sz w:val="24"/>
+          <w:szCs w:val="24"/>
+        </w:rPr>
+        <w:t>ra</w:t>
+      </w:r>
+      <w:r>
+        <w:rPr>
+          <w:sz w:val="24"/>
+          <w:szCs w:val="24"/>
+        </w:rPr>
+        <w:t>s</w:t>
+      </w:r>
+      <w:r>
+        <w:rPr>
+          <w:sz w:val="24"/>
+          <w:szCs w:val="24"/>
+        </w:rPr>
+        <w:t>or</w:t>
+      </w:r>
+      <w:proofErr w:type="spellEnd"/>
+      <w:r>
+        <w:rPr>
+          <w:sz w:val="24"/>
+          <w:szCs w:val="24"/>
+        </w:rPr>
+        <w:t xml:space="preserve"> option of the slicer, all the three lines will again appear but you want that at one specific time one visual will </w:t>
+      </w:r>
+      <w:r>
+        <w:rPr>
+          <w:sz w:val="24"/>
+          <w:szCs w:val="24"/>
+        </w:rPr>
+        <w:t xml:space="preserve">always </w:t>
+      </w:r>
+      <w:r>
+        <w:rPr>
+          <w:sz w:val="24"/>
+          <w:szCs w:val="24"/>
+        </w:rPr>
+        <w:t>appear</w:t>
+      </w:r>
+      <w:r>
+        <w:rPr>
+          <w:sz w:val="24"/>
+          <w:szCs w:val="24"/>
+        </w:rPr>
+        <w:t xml:space="preserve"> no matter we have clicked </w:t>
+      </w:r>
+      <w:proofErr w:type="spellStart"/>
+      <w:r>
+        <w:rPr>
+          <w:sz w:val="24"/>
+          <w:szCs w:val="24"/>
+        </w:rPr>
+        <w:t>erasor</w:t>
+      </w:r>
+      <w:proofErr w:type="spellEnd"/>
+      <w:r>
+        <w:rPr>
+          <w:sz w:val="24"/>
+          <w:szCs w:val="24"/>
+        </w:rPr>
+        <w:t xml:space="preserve"> or not</w:t>
+      </w:r>
+      <w:r>
+        <w:rPr>
+          <w:sz w:val="24"/>
+          <w:szCs w:val="24"/>
+        </w:rPr>
+        <w:t>.</w:t>
+      </w:r>
+      <w:r>
+        <w:rPr>
+          <w:sz w:val="24"/>
+          <w:szCs w:val="24"/>
+        </w:rPr>
+        <w:t xml:space="preserve"> </w:t>
+      </w:r>
+      <w:r>
+        <w:rPr>
+          <w:sz w:val="24"/>
+          <w:szCs w:val="24"/>
+        </w:rPr>
+        <w:t xml:space="preserve">So that's why, click on the slicer settings and click Force Selection. By using Force Selection </w:t>
+      </w:r>
+      <w:r>
+        <w:rPr>
+          <w:sz w:val="24"/>
+          <w:szCs w:val="24"/>
+        </w:rPr>
+        <w:t xml:space="preserve">ON, </w:t>
+      </w:r>
+      <w:r>
+        <w:rPr>
+          <w:sz w:val="24"/>
+          <w:szCs w:val="24"/>
+        </w:rPr>
+        <w:t xml:space="preserve"> you </w:t>
+      </w:r>
+      <w:proofErr w:type="spellStart"/>
+      <w:r>
+        <w:rPr>
+          <w:sz w:val="24"/>
+          <w:szCs w:val="24"/>
+        </w:rPr>
+        <w:t>can not</w:t>
+      </w:r>
+      <w:proofErr w:type="spellEnd"/>
+      <w:r>
+        <w:rPr>
+          <w:sz w:val="24"/>
+          <w:szCs w:val="24"/>
+        </w:rPr>
+        <w:t xml:space="preserve"> use the </w:t>
+      </w:r>
+      <w:proofErr w:type="spellStart"/>
+      <w:r>
+        <w:rPr>
+          <w:sz w:val="24"/>
+          <w:szCs w:val="24"/>
+        </w:rPr>
+        <w:t>erasor</w:t>
+      </w:r>
+      <w:proofErr w:type="spellEnd"/>
+      <w:r>
+        <w:rPr>
+          <w:sz w:val="24"/>
+          <w:szCs w:val="24"/>
+        </w:rPr>
+        <w:t xml:space="preserve"> option.</w:t>
+      </w:r>
+      <w:r>
+        <w:rPr>
+          <w:sz w:val="24"/>
+          <w:szCs w:val="24"/>
+        </w:rPr>
+        <w:t xml:space="preserve"> </w:t>
+      </w:r>
+    </w:p>
+    <w:p>
+      <w:pPr>
+        <w:rPr>
+          <w:b/>
+          <w:bCs/>
+          <w:sz w:val="24"/>
+          <w:szCs w:val="24"/>
+        </w:rPr>
+      </w:pPr>
+      <w:r>
+        <w:rPr>
+          <w:b/>
+          <w:bCs/>
+          <w:sz w:val="24"/>
+          <w:szCs w:val="24"/>
+        </w:rPr>
+        <w:t>Inventory turnover rate:</w:t>
+      </w:r>
+    </w:p>
+    <w:p>
+      <w:pPr>
+        <w:rPr>
+          <w:sz w:val="24"/>
+          <w:szCs w:val="24"/>
+        </w:rPr>
+      </w:pPr>
+      <w:r>
+        <w:rPr>
+          <w:sz w:val="24"/>
+          <w:szCs w:val="24"/>
+        </w:rPr>
+        <w:t>It tells how many times a company sold and again restocked its inventory.</w:t>
+      </w:r>
+      <w:r>
+        <w:rPr>
+          <w:sz w:val="24"/>
+          <w:szCs w:val="24"/>
+        </w:rPr>
+        <w:t xml:space="preserve"> </w:t>
+      </w:r>
+      <w:r>
+        <w:rPr>
+          <w:sz w:val="24"/>
+          <w:szCs w:val="24"/>
+        </w:rPr>
+        <w:t xml:space="preserve">If inventory value is 4, then it means a company sold </w:t>
+      </w:r>
+      <w:r>
+        <w:rPr>
+          <w:sz w:val="24"/>
+          <w:szCs w:val="24"/>
+        </w:rPr>
+        <w:t xml:space="preserve">and restocked </w:t>
+      </w:r>
+      <w:r>
+        <w:rPr>
+          <w:sz w:val="24"/>
+          <w:szCs w:val="24"/>
+        </w:rPr>
+        <w:t>its inventory four times</w:t>
+      </w:r>
+      <w:r>
+        <w:rPr>
+          <w:sz w:val="24"/>
+          <w:szCs w:val="24"/>
+        </w:rPr>
+        <w:t xml:space="preserve">. </w:t>
+      </w:r>
+      <w:r>
+        <w:rPr>
+          <w:sz w:val="24"/>
+          <w:szCs w:val="24"/>
+        </w:rPr>
+        <w:t>It is calculated by dividing cost of goods sold by inventory value. If cost of goods is calculated for one year, it means that in that specific one year the company has sold and restocked its inventory four times if the answer is four.</w:t>
+      </w:r>
+      <w:r>
+        <w:rPr>
+          <w:sz w:val="24"/>
+          <w:szCs w:val="24"/>
+        </w:rPr>
+        <w:t xml:space="preserve"> </w:t>
+      </w:r>
+      <w:r>
+        <w:rPr>
+          <w:sz w:val="24"/>
+          <w:szCs w:val="24"/>
+        </w:rPr>
+        <w:t>COGS and Average Inventory must be from the SAME period</w:t>
+      </w:r>
+    </w:p>
+    <w:p>
+      <w:pPr>
+        <w:rPr>
+          <w:sz w:val="24"/>
+          <w:szCs w:val="24"/>
+        </w:rPr>
+      </w:pPr>
+      <w:r>
+        <w:rPr>
+          <w:sz w:val="24"/>
+          <w:szCs w:val="24"/>
+        </w:rPr>
+        <w:t>You can also use total sales quantity and divide it with the inventory value but this one is not highly reliable. Highly reliable is dividing cost of goods sold with average inventory.</w:t>
+      </w:r>
     </w:p>
     <w:p>
       <w:pPr>
@@ -2732,6 +3326,155 @@
     </w:lvl>
   </w:abstractNum>
   <w:abstractNum w:abstractNumId="2" w15:restartNumberingAfterBreak="0">
+    <w:nsid w:val="56D72E16"/>
+    <w:multiLevelType w:val="multilevel"/>
+    <w:tmpl w:val="68F0225E"/>
+    <w:lvl w:ilvl="0">
+      <w:start w:val="1"/>
+      <w:numFmt w:val="bullet"/>
+      <w:lvlText w:val=""/>
+      <w:lvlJc w:val="left"/>
+      <w:pPr>
+        <w:tabs>
+          <w:tab w:val="num" w:pos="720"/>
+        </w:tabs>
+        <w:ind w:left="720" w:hanging="360"/>
+      </w:pPr>
+      <w:rPr>
+        <w:rFonts w:ascii="Symbol" w:hAnsi="Symbol" w:hint="default"/>
+        <w:sz w:val="20"/>
+      </w:rPr>
+    </w:lvl>
+    <w:lvl w:ilvl="1" w:tentative="1">
+      <w:start w:val="1"/>
+      <w:numFmt w:val="bullet"/>
+      <w:lvlText w:val="o"/>
+      <w:lvlJc w:val="left"/>
+      <w:pPr>
+        <w:tabs>
+          <w:tab w:val="num" w:pos="1440"/>
+        </w:tabs>
+        <w:ind w:left="1440" w:hanging="360"/>
+      </w:pPr>
+      <w:rPr>
+        <w:rFonts w:ascii="Courier New" w:hAnsi="Courier New" w:hint="default"/>
+        <w:sz w:val="20"/>
+      </w:rPr>
+    </w:lvl>
+    <w:lvl w:ilvl="2" w:tentative="1">
+      <w:start w:val="1"/>
+      <w:numFmt w:val="bullet"/>
+      <w:lvlText w:val=""/>
+      <w:lvlJc w:val="left"/>
+      <w:pPr>
+        <w:tabs>
+          <w:tab w:val="num" w:pos="2160"/>
+        </w:tabs>
+        <w:ind w:left="2160" w:hanging="360"/>
+      </w:pPr>
+      <w:rPr>
+        <w:rFonts w:ascii="Wingdings" w:hAnsi="Wingdings" w:hint="default"/>
+        <w:sz w:val="20"/>
+      </w:rPr>
+    </w:lvl>
+    <w:lvl w:ilvl="3" w:tentative="1">
+      <w:start w:val="1"/>
+      <w:numFmt w:val="bullet"/>
+      <w:lvlText w:val=""/>
+      <w:lvlJc w:val="left"/>
+      <w:pPr>
+        <w:tabs>
+          <w:tab w:val="num" w:pos="2880"/>
+        </w:tabs>
+        <w:ind w:left="2880" w:hanging="360"/>
+      </w:pPr>
+      <w:rPr>
+        <w:rFonts w:ascii="Wingdings" w:hAnsi="Wingdings" w:hint="default"/>
+        <w:sz w:val="20"/>
+      </w:rPr>
+    </w:lvl>
+    <w:lvl w:ilvl="4" w:tentative="1">
+      <w:start w:val="1"/>
+      <w:numFmt w:val="bullet"/>
+      <w:lvlText w:val=""/>
+      <w:lvlJc w:val="left"/>
+      <w:pPr>
+        <w:tabs>
+          <w:tab w:val="num" w:pos="3600"/>
+        </w:tabs>
+        <w:ind w:left="3600" w:hanging="360"/>
+      </w:pPr>
+      <w:rPr>
+        <w:rFonts w:ascii="Wingdings" w:hAnsi="Wingdings" w:hint="default"/>
+        <w:sz w:val="20"/>
+      </w:rPr>
+    </w:lvl>
+    <w:lvl w:ilvl="5" w:tentative="1">
+      <w:start w:val="1"/>
+      <w:numFmt w:val="bullet"/>
+      <w:lvlText w:val=""/>
+      <w:lvlJc w:val="left"/>
+      <w:pPr>
+        <w:tabs>
+          <w:tab w:val="num" w:pos="4320"/>
+        </w:tabs>
+        <w:ind w:left="4320" w:hanging="360"/>
+      </w:pPr>
+      <w:rPr>
+        <w:rFonts w:ascii="Wingdings" w:hAnsi="Wingdings" w:hint="default"/>
+        <w:sz w:val="20"/>
+      </w:rPr>
+    </w:lvl>
+    <w:lvl w:ilvl="6" w:tentative="1">
+      <w:start w:val="1"/>
+      <w:numFmt w:val="bullet"/>
+      <w:lvlText w:val=""/>
+      <w:lvlJc w:val="left"/>
+      <w:pPr>
+        <w:tabs>
+          <w:tab w:val="num" w:pos="5040"/>
+        </w:tabs>
+        <w:ind w:left="5040" w:hanging="360"/>
+      </w:pPr>
+      <w:rPr>
+        <w:rFonts w:ascii="Wingdings" w:hAnsi="Wingdings" w:hint="default"/>
+        <w:sz w:val="20"/>
+      </w:rPr>
+    </w:lvl>
+    <w:lvl w:ilvl="7" w:tentative="1">
+      <w:start w:val="1"/>
+      <w:numFmt w:val="bullet"/>
+      <w:lvlText w:val=""/>
+      <w:lvlJc w:val="left"/>
+      <w:pPr>
+        <w:tabs>
+          <w:tab w:val="num" w:pos="5760"/>
+        </w:tabs>
+        <w:ind w:left="5760" w:hanging="360"/>
+      </w:pPr>
+      <w:rPr>
+        <w:rFonts w:ascii="Wingdings" w:hAnsi="Wingdings" w:hint="default"/>
+        <w:sz w:val="20"/>
+      </w:rPr>
+    </w:lvl>
+    <w:lvl w:ilvl="8" w:tentative="1">
+      <w:start w:val="1"/>
+      <w:numFmt w:val="bullet"/>
+      <w:lvlText w:val=""/>
+      <w:lvlJc w:val="left"/>
+      <w:pPr>
+        <w:tabs>
+          <w:tab w:val="num" w:pos="6480"/>
+        </w:tabs>
+        <w:ind w:left="6480" w:hanging="360"/>
+      </w:pPr>
+      <w:rPr>
+        <w:rFonts w:ascii="Wingdings" w:hAnsi="Wingdings" w:hint="default"/>
+        <w:sz w:val="20"/>
+      </w:rPr>
+    </w:lvl>
+  </w:abstractNum>
+  <w:abstractNum w:abstractNumId="3" w15:restartNumberingAfterBreak="0">
     <w:nsid w:val="61FE14EA"/>
     <w:multiLevelType w:val="multilevel"/>
     <w:tmpl w:val="1EE0C784"/>
@@ -2887,6 +3630,9 @@
     <w:abstractNumId w:val="1"/>
   </w:num>
   <w:num w:numId="3" w16cid:durableId="1646738463">
+    <w:abstractNumId w:val="3"/>
+  </w:num>
+  <w:num w:numId="4" w16cid:durableId="1510363719">
     <w:abstractNumId w:val="2"/>
   </w:num>
 </w:numbering>
@@ -3493,7 +4239,6 @@
   <w:style w:type="character" w:default="1" w:styleId="DefaultParagraphFont">
     <w:name w:val="Default Paragraph Font"/>
     <w:uiPriority w:val="1"/>
-    <w:semiHidden/>
     <w:unhideWhenUsed/>
   </w:style>
   <w:style w:type="table" w:default="1" w:styleId="TableNormal">

</xml_diff>

<commit_message>
analysed shipments, customers and inventory data
</commit_message>
<xml_diff>
--- a/learning_material_of supply chain analysis.docx
+++ b/learning_material_of supply chain analysis.docx
@@ -2557,16 +2557,7 @@
           <w:sz w:val="24"/>
           <w:szCs w:val="24"/>
         </w:rPr>
-        <w:t xml:space="preserve">se case of using the fields option in the new parameter </w:t>
-      </w:r>
-      <w:r>
-        <w:rPr>
-          <w:b/>
-          <w:bCs/>
-          <w:sz w:val="24"/>
-          <w:szCs w:val="24"/>
-        </w:rPr>
-        <w:t>under modeling tab:</w:t>
+        <w:t>se case of using the fields option in the new parameter under modeling tab:</w:t>
       </w:r>
     </w:p>
     <w:p>
@@ -3066,6 +3057,9 @@
     </w:p>
     <w:p>
       <w:pPr>
+        <w:pBdr>
+          <w:bottom w:val="single" w:sz="6" w:space="1" w:color="auto"/>
+        </w:pBdr>
         <w:rPr>
           <w:sz w:val="24"/>
           <w:szCs w:val="24"/>
@@ -4239,6 +4233,7 @@
   <w:style w:type="character" w:default="1" w:styleId="DefaultParagraphFont">
     <w:name w:val="Default Paragraph Font"/>
     <w:uiPriority w:val="1"/>
+    <w:semiHidden/>
     <w:unhideWhenUsed/>
   </w:style>
   <w:style w:type="table" w:default="1" w:styleId="TableNormal">

</xml_diff>